<commit_message>
Workbook: diluted shares and EPS from the 10-K EPS note, actual EBITDA, FrontPage inputs and text boxes; verification form regenerated with the added rows
Co-Authored-By: Claude Fable 5.1 <noreply@anthropic.com>
</commit_message>
<xml_diff>
--- a/research/03 Drafts/Module 2 - Data verification.docx
+++ b/research/03 Drafts/Module 2 - Data verification.docx
@@ -27,7 +27,7 @@
           <w:sz w:val="20"/>
           <w:szCs w:val="20"/>
         </w:rPr>
-        <w:t xml:space="preserve">[Company]  ·  workbook QD-HSY.xlsx  ·  form made 2026-10-04</w:t>
+        <w:t xml:space="preserve">The Hershey Company (HSY)  ·  workbook QD-HSY.xlsx  ·  form made 2026-10-04</w:t>
       </w:r>
     </w:p>
     <w:p>
@@ -81,7 +81,7 @@
           <w:sz w:val="24"/>
           <w:szCs w:val="24"/>
         </w:rPr>
-        <w:t xml:space="preserve">Summary rows  (4 figures)</w:t>
+        <w:t xml:space="preserve">Summary rows  (10 figures)</w:t>
       </w:r>
     </w:p>
     <w:p>
@@ -776,6 +776,774 @@
           </w:p>
         </w:tc>
       </w:tr>
+      <w:tr>
+        <w:tc>
+          <w:tcPr>
+            <w:tcW w:w="4300" w:type="dxa"/>
+          </w:tcPr>
+          <w:p>
+            <w:pPr>
+              <w:spacing w:before="20" w:after="20"/>
+            </w:pPr>
+            <w:r>
+              <w:rPr>
+                <w:rFonts w:ascii="Calibri" w:hAnsi="Calibri" w:cs="Calibri"/>
+                <w:sz w:val="18"/>
+                <w:szCs w:val="18"/>
+              </w:rPr>
+              <w:t xml:space="preserve">FD EPS (t) - Current FY</w:t>
+            </w:r>
+          </w:p>
+        </w:tc>
+        <w:tc>
+          <w:tcPr>
+            <w:tcW w:w="900" w:type="dxa"/>
+          </w:tcPr>
+          <w:p>
+            <w:pPr>
+              <w:spacing w:before="20" w:after="20"/>
+            </w:pPr>
+            <w:r>
+              <w:rPr>
+                <w:rFonts w:ascii="Calibri" w:hAnsi="Calibri" w:cs="Calibri"/>
+                <w:sz w:val="18"/>
+                <w:szCs w:val="18"/>
+              </w:rPr>
+              <w:t xml:space="preserve">C7</w:t>
+            </w:r>
+          </w:p>
+        </w:tc>
+        <w:tc>
+          <w:tcPr>
+            <w:tcW w:w="900" w:type="dxa"/>
+          </w:tcPr>
+          <w:p>
+            <w:pPr>
+              <w:spacing w:before="20" w:after="20"/>
+            </w:pPr>
+            <w:r>
+              <w:rPr>
+                <w:rFonts w:ascii="Calibri" w:hAnsi="Calibri" w:cs="Calibri"/>
+                <w:sz w:val="18"/>
+                <w:szCs w:val="18"/>
+              </w:rPr>
+              <w:t xml:space="preserve">2024A</w:t>
+            </w:r>
+          </w:p>
+        </w:tc>
+        <w:tc>
+          <w:tcPr>
+            <w:tcW w:w="2000" w:type="dxa"/>
+          </w:tcPr>
+          <w:p>
+            <w:pPr>
+              <w:spacing w:before="20" w:after="20"/>
+            </w:pPr>
+            <w:r>
+              <w:rPr>
+                <w:rFonts w:ascii="Calibri" w:hAnsi="Calibri" w:cs="Calibri"/>
+                <w:sz w:val="18"/>
+                <w:szCs w:val="18"/>
+              </w:rPr>
+              <w:t xml:space="preserve">10.92</w:t>
+            </w:r>
+          </w:p>
+        </w:tc>
+        <w:tc>
+          <w:tcPr>
+            <w:tcW w:w="1300" w:type="dxa"/>
+          </w:tcPr>
+          <w:p>
+            <w:pPr>
+              <w:spacing w:before="20" w:after="20"/>
+            </w:pPr>
+            <w:r>
+              <w:rPr>
+                <w:rFonts w:ascii="Calibri" w:hAnsi="Calibri" w:cs="Calibri"/>
+                <w:sz w:val="18"/>
+                <w:szCs w:val="18"/>
+              </w:rPr>
+              <w:t xml:space="preserve"/>
+            </w:r>
+          </w:p>
+        </w:tc>
+        <w:tc>
+          <w:tcPr>
+            <w:tcW w:w="1300" w:type="dxa"/>
+          </w:tcPr>
+          <w:p>
+            <w:pPr>
+              <w:spacing w:before="20" w:after="20"/>
+            </w:pPr>
+            <w:r>
+              <w:rPr>
+                <w:rFonts w:ascii="Calibri" w:hAnsi="Calibri" w:cs="Calibri"/>
+                <w:sz w:val="18"/>
+                <w:szCs w:val="18"/>
+              </w:rPr>
+              <w:t xml:space="preserve"/>
+            </w:r>
+          </w:p>
+        </w:tc>
+        <w:tc>
+          <w:tcPr>
+            <w:tcW w:w="2980" w:type="dxa"/>
+          </w:tcPr>
+          <w:p>
+            <w:pPr>
+              <w:spacing w:before="20" w:after="20"/>
+            </w:pPr>
+            <w:r>
+              <w:rPr>
+                <w:rFonts w:ascii="Calibri" w:hAnsi="Calibri" w:cs="Calibri"/>
+                <w:sz w:val="18"/>
+                <w:szCs w:val="18"/>
+              </w:rPr>
+              <w:t xml:space="preserve"/>
+            </w:r>
+          </w:p>
+        </w:tc>
+      </w:tr>
+      <w:tr>
+        <w:tc>
+          <w:tcPr>
+            <w:tcW w:w="4300" w:type="dxa"/>
+          </w:tcPr>
+          <w:p>
+            <w:pPr>
+              <w:spacing w:before="20" w:after="20"/>
+            </w:pPr>
+            <w:r>
+              <w:rPr>
+                <w:rFonts w:ascii="Calibri" w:hAnsi="Calibri" w:cs="Calibri"/>
+                <w:sz w:val="18"/>
+                <w:szCs w:val="18"/>
+              </w:rPr>
+              <w:t xml:space="preserve">FD EPS (t) - Current FY</w:t>
+            </w:r>
+          </w:p>
+        </w:tc>
+        <w:tc>
+          <w:tcPr>
+            <w:tcW w:w="900" w:type="dxa"/>
+          </w:tcPr>
+          <w:p>
+            <w:pPr>
+              <w:spacing w:before="20" w:after="20"/>
+            </w:pPr>
+            <w:r>
+              <w:rPr>
+                <w:rFonts w:ascii="Calibri" w:hAnsi="Calibri" w:cs="Calibri"/>
+                <w:sz w:val="18"/>
+                <w:szCs w:val="18"/>
+              </w:rPr>
+              <w:t xml:space="preserve">D7</w:t>
+            </w:r>
+          </w:p>
+        </w:tc>
+        <w:tc>
+          <w:tcPr>
+            <w:tcW w:w="900" w:type="dxa"/>
+          </w:tcPr>
+          <w:p>
+            <w:pPr>
+              <w:spacing w:before="20" w:after="20"/>
+            </w:pPr>
+            <w:r>
+              <w:rPr>
+                <w:rFonts w:ascii="Calibri" w:hAnsi="Calibri" w:cs="Calibri"/>
+                <w:sz w:val="18"/>
+                <w:szCs w:val="18"/>
+              </w:rPr>
+              <w:t xml:space="preserve">2025A</w:t>
+            </w:r>
+          </w:p>
+        </w:tc>
+        <w:tc>
+          <w:tcPr>
+            <w:tcW w:w="2000" w:type="dxa"/>
+          </w:tcPr>
+          <w:p>
+            <w:pPr>
+              <w:spacing w:before="20" w:after="20"/>
+            </w:pPr>
+            <w:r>
+              <w:rPr>
+                <w:rFonts w:ascii="Calibri" w:hAnsi="Calibri" w:cs="Calibri"/>
+                <w:sz w:val="18"/>
+                <w:szCs w:val="18"/>
+              </w:rPr>
+              <w:t xml:space="preserve">4.34</w:t>
+            </w:r>
+          </w:p>
+        </w:tc>
+        <w:tc>
+          <w:tcPr>
+            <w:tcW w:w="1300" w:type="dxa"/>
+          </w:tcPr>
+          <w:p>
+            <w:pPr>
+              <w:spacing w:before="20" w:after="20"/>
+            </w:pPr>
+            <w:r>
+              <w:rPr>
+                <w:rFonts w:ascii="Calibri" w:hAnsi="Calibri" w:cs="Calibri"/>
+                <w:sz w:val="18"/>
+                <w:szCs w:val="18"/>
+              </w:rPr>
+              <w:t xml:space="preserve"/>
+            </w:r>
+          </w:p>
+        </w:tc>
+        <w:tc>
+          <w:tcPr>
+            <w:tcW w:w="1300" w:type="dxa"/>
+          </w:tcPr>
+          <w:p>
+            <w:pPr>
+              <w:spacing w:before="20" w:after="20"/>
+            </w:pPr>
+            <w:r>
+              <w:rPr>
+                <w:rFonts w:ascii="Calibri" w:hAnsi="Calibri" w:cs="Calibri"/>
+                <w:sz w:val="18"/>
+                <w:szCs w:val="18"/>
+              </w:rPr>
+              <w:t xml:space="preserve"/>
+            </w:r>
+          </w:p>
+        </w:tc>
+        <w:tc>
+          <w:tcPr>
+            <w:tcW w:w="2980" w:type="dxa"/>
+          </w:tcPr>
+          <w:p>
+            <w:pPr>
+              <w:spacing w:before="20" w:after="20"/>
+            </w:pPr>
+            <w:r>
+              <w:rPr>
+                <w:rFonts w:ascii="Calibri" w:hAnsi="Calibri" w:cs="Calibri"/>
+                <w:sz w:val="18"/>
+                <w:szCs w:val="18"/>
+              </w:rPr>
+              <w:t xml:space="preserve"/>
+            </w:r>
+          </w:p>
+        </w:tc>
+      </w:tr>
+      <w:tr>
+        <w:tc>
+          <w:tcPr>
+            <w:tcW w:w="4300" w:type="dxa"/>
+          </w:tcPr>
+          <w:p>
+            <w:pPr>
+              <w:spacing w:before="20" w:after="20"/>
+            </w:pPr>
+            <w:r>
+              <w:rPr>
+                <w:rFonts w:ascii="Calibri" w:hAnsi="Calibri" w:cs="Calibri"/>
+                <w:sz w:val="18"/>
+                <w:szCs w:val="18"/>
+              </w:rPr>
+              <w:t xml:space="preserve">FD EPS (t-1) - Previous FY</w:t>
+            </w:r>
+          </w:p>
+        </w:tc>
+        <w:tc>
+          <w:tcPr>
+            <w:tcW w:w="900" w:type="dxa"/>
+          </w:tcPr>
+          <w:p>
+            <w:pPr>
+              <w:spacing w:before="20" w:after="20"/>
+            </w:pPr>
+            <w:r>
+              <w:rPr>
+                <w:rFonts w:ascii="Calibri" w:hAnsi="Calibri" w:cs="Calibri"/>
+                <w:sz w:val="18"/>
+                <w:szCs w:val="18"/>
+              </w:rPr>
+              <w:t xml:space="preserve">C8</w:t>
+            </w:r>
+          </w:p>
+        </w:tc>
+        <w:tc>
+          <w:tcPr>
+            <w:tcW w:w="900" w:type="dxa"/>
+          </w:tcPr>
+          <w:p>
+            <w:pPr>
+              <w:spacing w:before="20" w:after="20"/>
+            </w:pPr>
+            <w:r>
+              <w:rPr>
+                <w:rFonts w:ascii="Calibri" w:hAnsi="Calibri" w:cs="Calibri"/>
+                <w:sz w:val="18"/>
+                <w:szCs w:val="18"/>
+              </w:rPr>
+              <w:t xml:space="preserve">2024A</w:t>
+            </w:r>
+          </w:p>
+        </w:tc>
+        <w:tc>
+          <w:tcPr>
+            <w:tcW w:w="2000" w:type="dxa"/>
+          </w:tcPr>
+          <w:p>
+            <w:pPr>
+              <w:spacing w:before="20" w:after="20"/>
+            </w:pPr>
+            <w:r>
+              <w:rPr>
+                <w:rFonts w:ascii="Calibri" w:hAnsi="Calibri" w:cs="Calibri"/>
+                <w:sz w:val="18"/>
+                <w:szCs w:val="18"/>
+              </w:rPr>
+              <w:t xml:space="preserve">9.06</w:t>
+            </w:r>
+          </w:p>
+        </w:tc>
+        <w:tc>
+          <w:tcPr>
+            <w:tcW w:w="1300" w:type="dxa"/>
+          </w:tcPr>
+          <w:p>
+            <w:pPr>
+              <w:spacing w:before="20" w:after="20"/>
+            </w:pPr>
+            <w:r>
+              <w:rPr>
+                <w:rFonts w:ascii="Calibri" w:hAnsi="Calibri" w:cs="Calibri"/>
+                <w:sz w:val="18"/>
+                <w:szCs w:val="18"/>
+              </w:rPr>
+              <w:t xml:space="preserve"/>
+            </w:r>
+          </w:p>
+        </w:tc>
+        <w:tc>
+          <w:tcPr>
+            <w:tcW w:w="1300" w:type="dxa"/>
+          </w:tcPr>
+          <w:p>
+            <w:pPr>
+              <w:spacing w:before="20" w:after="20"/>
+            </w:pPr>
+            <w:r>
+              <w:rPr>
+                <w:rFonts w:ascii="Calibri" w:hAnsi="Calibri" w:cs="Calibri"/>
+                <w:sz w:val="18"/>
+                <w:szCs w:val="18"/>
+              </w:rPr>
+              <w:t xml:space="preserve"/>
+            </w:r>
+          </w:p>
+        </w:tc>
+        <w:tc>
+          <w:tcPr>
+            <w:tcW w:w="2980" w:type="dxa"/>
+          </w:tcPr>
+          <w:p>
+            <w:pPr>
+              <w:spacing w:before="20" w:after="20"/>
+            </w:pPr>
+            <w:r>
+              <w:rPr>
+                <w:rFonts w:ascii="Calibri" w:hAnsi="Calibri" w:cs="Calibri"/>
+                <w:sz w:val="18"/>
+                <w:szCs w:val="18"/>
+              </w:rPr>
+              <w:t xml:space="preserve"/>
+            </w:r>
+          </w:p>
+        </w:tc>
+      </w:tr>
+      <w:tr>
+        <w:tc>
+          <w:tcPr>
+            <w:tcW w:w="4300" w:type="dxa"/>
+          </w:tcPr>
+          <w:p>
+            <w:pPr>
+              <w:spacing w:before="20" w:after="20"/>
+            </w:pPr>
+            <w:r>
+              <w:rPr>
+                <w:rFonts w:ascii="Calibri" w:hAnsi="Calibri" w:cs="Calibri"/>
+                <w:sz w:val="18"/>
+                <w:szCs w:val="18"/>
+              </w:rPr>
+              <w:t xml:space="preserve">FD EPS (t-1) - Previous FY</w:t>
+            </w:r>
+          </w:p>
+        </w:tc>
+        <w:tc>
+          <w:tcPr>
+            <w:tcW w:w="900" w:type="dxa"/>
+          </w:tcPr>
+          <w:p>
+            <w:pPr>
+              <w:spacing w:before="20" w:after="20"/>
+            </w:pPr>
+            <w:r>
+              <w:rPr>
+                <w:rFonts w:ascii="Calibri" w:hAnsi="Calibri" w:cs="Calibri"/>
+                <w:sz w:val="18"/>
+                <w:szCs w:val="18"/>
+              </w:rPr>
+              <w:t xml:space="preserve">D8</w:t>
+            </w:r>
+          </w:p>
+        </w:tc>
+        <w:tc>
+          <w:tcPr>
+            <w:tcW w:w="900" w:type="dxa"/>
+          </w:tcPr>
+          <w:p>
+            <w:pPr>
+              <w:spacing w:before="20" w:after="20"/>
+            </w:pPr>
+            <w:r>
+              <w:rPr>
+                <w:rFonts w:ascii="Calibri" w:hAnsi="Calibri" w:cs="Calibri"/>
+                <w:sz w:val="18"/>
+                <w:szCs w:val="18"/>
+              </w:rPr>
+              <w:t xml:space="preserve">2025A</w:t>
+            </w:r>
+          </w:p>
+        </w:tc>
+        <w:tc>
+          <w:tcPr>
+            <w:tcW w:w="2000" w:type="dxa"/>
+          </w:tcPr>
+          <w:p>
+            <w:pPr>
+              <w:spacing w:before="20" w:after="20"/>
+            </w:pPr>
+            <w:r>
+              <w:rPr>
+                <w:rFonts w:ascii="Calibri" w:hAnsi="Calibri" w:cs="Calibri"/>
+                <w:sz w:val="18"/>
+                <w:szCs w:val="18"/>
+              </w:rPr>
+              <w:t xml:space="preserve">10.92</w:t>
+            </w:r>
+          </w:p>
+        </w:tc>
+        <w:tc>
+          <w:tcPr>
+            <w:tcW w:w="1300" w:type="dxa"/>
+          </w:tcPr>
+          <w:p>
+            <w:pPr>
+              <w:spacing w:before="20" w:after="20"/>
+            </w:pPr>
+            <w:r>
+              <w:rPr>
+                <w:rFonts w:ascii="Calibri" w:hAnsi="Calibri" w:cs="Calibri"/>
+                <w:sz w:val="18"/>
+                <w:szCs w:val="18"/>
+              </w:rPr>
+              <w:t xml:space="preserve"/>
+            </w:r>
+          </w:p>
+        </w:tc>
+        <w:tc>
+          <w:tcPr>
+            <w:tcW w:w="1300" w:type="dxa"/>
+          </w:tcPr>
+          <w:p>
+            <w:pPr>
+              <w:spacing w:before="20" w:after="20"/>
+            </w:pPr>
+            <w:r>
+              <w:rPr>
+                <w:rFonts w:ascii="Calibri" w:hAnsi="Calibri" w:cs="Calibri"/>
+                <w:sz w:val="18"/>
+                <w:szCs w:val="18"/>
+              </w:rPr>
+              <w:t xml:space="preserve"/>
+            </w:r>
+          </w:p>
+        </w:tc>
+        <w:tc>
+          <w:tcPr>
+            <w:tcW w:w="2980" w:type="dxa"/>
+          </w:tcPr>
+          <w:p>
+            <w:pPr>
+              <w:spacing w:before="20" w:after="20"/>
+            </w:pPr>
+            <w:r>
+              <w:rPr>
+                <w:rFonts w:ascii="Calibri" w:hAnsi="Calibri" w:cs="Calibri"/>
+                <w:sz w:val="18"/>
+                <w:szCs w:val="18"/>
+              </w:rPr>
+              <w:t xml:space="preserve"/>
+            </w:r>
+          </w:p>
+        </w:tc>
+      </w:tr>
+      <w:tr>
+        <w:tc>
+          <w:tcPr>
+            <w:tcW w:w="4300" w:type="dxa"/>
+          </w:tcPr>
+          <w:p>
+            <w:pPr>
+              <w:spacing w:before="20" w:after="20"/>
+            </w:pPr>
+            <w:r>
+              <w:rPr>
+                <w:rFonts w:ascii="Calibri" w:hAnsi="Calibri" w:cs="Calibri"/>
+                <w:sz w:val="18"/>
+                <w:szCs w:val="18"/>
+              </w:rPr>
+              <w:t xml:space="preserve">FD Shares outstanding (M)</w:t>
+            </w:r>
+          </w:p>
+        </w:tc>
+        <w:tc>
+          <w:tcPr>
+            <w:tcW w:w="900" w:type="dxa"/>
+          </w:tcPr>
+          <w:p>
+            <w:pPr>
+              <w:spacing w:before="20" w:after="20"/>
+            </w:pPr>
+            <w:r>
+              <w:rPr>
+                <w:rFonts w:ascii="Calibri" w:hAnsi="Calibri" w:cs="Calibri"/>
+                <w:sz w:val="18"/>
+                <w:szCs w:val="18"/>
+              </w:rPr>
+              <w:t xml:space="preserve">C9</w:t>
+            </w:r>
+          </w:p>
+        </w:tc>
+        <w:tc>
+          <w:tcPr>
+            <w:tcW w:w="900" w:type="dxa"/>
+          </w:tcPr>
+          <w:p>
+            <w:pPr>
+              <w:spacing w:before="20" w:after="20"/>
+            </w:pPr>
+            <w:r>
+              <w:rPr>
+                <w:rFonts w:ascii="Calibri" w:hAnsi="Calibri" w:cs="Calibri"/>
+                <w:sz w:val="18"/>
+                <w:szCs w:val="18"/>
+              </w:rPr>
+              <w:t xml:space="preserve">2024A</w:t>
+            </w:r>
+          </w:p>
+        </w:tc>
+        <w:tc>
+          <w:tcPr>
+            <w:tcW w:w="2000" w:type="dxa"/>
+          </w:tcPr>
+          <w:p>
+            <w:pPr>
+              <w:spacing w:before="20" w:after="20"/>
+            </w:pPr>
+            <w:r>
+              <w:rPr>
+                <w:rFonts w:ascii="Calibri" w:hAnsi="Calibri" w:cs="Calibri"/>
+                <w:sz w:val="18"/>
+                <w:szCs w:val="18"/>
+              </w:rPr>
+              <w:t xml:space="preserve">203.5</w:t>
+            </w:r>
+          </w:p>
+        </w:tc>
+        <w:tc>
+          <w:tcPr>
+            <w:tcW w:w="1300" w:type="dxa"/>
+          </w:tcPr>
+          <w:p>
+            <w:pPr>
+              <w:spacing w:before="20" w:after="20"/>
+            </w:pPr>
+            <w:r>
+              <w:rPr>
+                <w:rFonts w:ascii="Calibri" w:hAnsi="Calibri" w:cs="Calibri"/>
+                <w:sz w:val="18"/>
+                <w:szCs w:val="18"/>
+              </w:rPr>
+              <w:t xml:space="preserve"/>
+            </w:r>
+          </w:p>
+        </w:tc>
+        <w:tc>
+          <w:tcPr>
+            <w:tcW w:w="1300" w:type="dxa"/>
+          </w:tcPr>
+          <w:p>
+            <w:pPr>
+              <w:spacing w:before="20" w:after="20"/>
+            </w:pPr>
+            <w:r>
+              <w:rPr>
+                <w:rFonts w:ascii="Calibri" w:hAnsi="Calibri" w:cs="Calibri"/>
+                <w:sz w:val="18"/>
+                <w:szCs w:val="18"/>
+              </w:rPr>
+              <w:t xml:space="preserve"/>
+            </w:r>
+          </w:p>
+        </w:tc>
+        <w:tc>
+          <w:tcPr>
+            <w:tcW w:w="2980" w:type="dxa"/>
+          </w:tcPr>
+          <w:p>
+            <w:pPr>
+              <w:spacing w:before="20" w:after="20"/>
+            </w:pPr>
+            <w:r>
+              <w:rPr>
+                <w:rFonts w:ascii="Calibri" w:hAnsi="Calibri" w:cs="Calibri"/>
+                <w:sz w:val="18"/>
+                <w:szCs w:val="18"/>
+              </w:rPr>
+              <w:t xml:space="preserve"/>
+            </w:r>
+          </w:p>
+        </w:tc>
+      </w:tr>
+      <w:tr>
+        <w:tc>
+          <w:tcPr>
+            <w:tcW w:w="4300" w:type="dxa"/>
+          </w:tcPr>
+          <w:p>
+            <w:pPr>
+              <w:spacing w:before="20" w:after="20"/>
+            </w:pPr>
+            <w:r>
+              <w:rPr>
+                <w:rFonts w:ascii="Calibri" w:hAnsi="Calibri" w:cs="Calibri"/>
+                <w:sz w:val="18"/>
+                <w:szCs w:val="18"/>
+              </w:rPr>
+              <w:t xml:space="preserve">FD Shares outstanding (M)</w:t>
+            </w:r>
+          </w:p>
+        </w:tc>
+        <w:tc>
+          <w:tcPr>
+            <w:tcW w:w="900" w:type="dxa"/>
+          </w:tcPr>
+          <w:p>
+            <w:pPr>
+              <w:spacing w:before="20" w:after="20"/>
+            </w:pPr>
+            <w:r>
+              <w:rPr>
+                <w:rFonts w:ascii="Calibri" w:hAnsi="Calibri" w:cs="Calibri"/>
+                <w:sz w:val="18"/>
+                <w:szCs w:val="18"/>
+              </w:rPr>
+              <w:t xml:space="preserve">D9</w:t>
+            </w:r>
+          </w:p>
+        </w:tc>
+        <w:tc>
+          <w:tcPr>
+            <w:tcW w:w="900" w:type="dxa"/>
+          </w:tcPr>
+          <w:p>
+            <w:pPr>
+              <w:spacing w:before="20" w:after="20"/>
+            </w:pPr>
+            <w:r>
+              <w:rPr>
+                <w:rFonts w:ascii="Calibri" w:hAnsi="Calibri" w:cs="Calibri"/>
+                <w:sz w:val="18"/>
+                <w:szCs w:val="18"/>
+              </w:rPr>
+              <w:t xml:space="preserve">2025A</w:t>
+            </w:r>
+          </w:p>
+        </w:tc>
+        <w:tc>
+          <w:tcPr>
+            <w:tcW w:w="2000" w:type="dxa"/>
+          </w:tcPr>
+          <w:p>
+            <w:pPr>
+              <w:spacing w:before="20" w:after="20"/>
+            </w:pPr>
+            <w:r>
+              <w:rPr>
+                <w:rFonts w:ascii="Calibri" w:hAnsi="Calibri" w:cs="Calibri"/>
+                <w:sz w:val="18"/>
+                <w:szCs w:val="18"/>
+              </w:rPr>
+              <w:t xml:space="preserve">203.4</w:t>
+            </w:r>
+          </w:p>
+        </w:tc>
+        <w:tc>
+          <w:tcPr>
+            <w:tcW w:w="1300" w:type="dxa"/>
+          </w:tcPr>
+          <w:p>
+            <w:pPr>
+              <w:spacing w:before="20" w:after="20"/>
+            </w:pPr>
+            <w:r>
+              <w:rPr>
+                <w:rFonts w:ascii="Calibri" w:hAnsi="Calibri" w:cs="Calibri"/>
+                <w:sz w:val="18"/>
+                <w:szCs w:val="18"/>
+              </w:rPr>
+              <w:t xml:space="preserve"/>
+            </w:r>
+          </w:p>
+        </w:tc>
+        <w:tc>
+          <w:tcPr>
+            <w:tcW w:w="1300" w:type="dxa"/>
+          </w:tcPr>
+          <w:p>
+            <w:pPr>
+              <w:spacing w:before="20" w:after="20"/>
+            </w:pPr>
+            <w:r>
+              <w:rPr>
+                <w:rFonts w:ascii="Calibri" w:hAnsi="Calibri" w:cs="Calibri"/>
+                <w:sz w:val="18"/>
+                <w:szCs w:val="18"/>
+              </w:rPr>
+              <w:t xml:space="preserve"/>
+            </w:r>
+          </w:p>
+        </w:tc>
+        <w:tc>
+          <w:tcPr>
+            <w:tcW w:w="2980" w:type="dxa"/>
+          </w:tcPr>
+          <w:p>
+            <w:pPr>
+              <w:spacing w:before="20" w:after="20"/>
+            </w:pPr>
+            <w:r>
+              <w:rPr>
+                <w:rFonts w:ascii="Calibri" w:hAnsi="Calibri" w:cs="Calibri"/>
+                <w:sz w:val="18"/>
+                <w:szCs w:val="18"/>
+              </w:rPr>
+              <w:t xml:space="preserve"/>
+            </w:r>
+          </w:p>
+        </w:tc>
+      </w:tr>
     </w:tbl>
     <w:p>
       <w:pPr>
@@ -802,7 +1570,7 @@
           <w:sz w:val="24"/>
           <w:szCs w:val="24"/>
         </w:rPr>
-        <w:t xml:space="preserve">Income statement  (12 figures)</w:t>
+        <w:t xml:space="preserve">Income statement  (14 figures)</w:t>
       </w:r>
     </w:p>
     <w:p>
@@ -2463,6 +3231,262 @@
                 <w:szCs w:val="18"/>
               </w:rPr>
               <w:t xml:space="preserve">330.9</w:t>
+            </w:r>
+          </w:p>
+        </w:tc>
+        <w:tc>
+          <w:tcPr>
+            <w:tcW w:w="1300" w:type="dxa"/>
+          </w:tcPr>
+          <w:p>
+            <w:pPr>
+              <w:spacing w:before="20" w:after="20"/>
+            </w:pPr>
+            <w:r>
+              <w:rPr>
+                <w:rFonts w:ascii="Calibri" w:hAnsi="Calibri" w:cs="Calibri"/>
+                <w:sz w:val="18"/>
+                <w:szCs w:val="18"/>
+              </w:rPr>
+              <w:t xml:space="preserve"/>
+            </w:r>
+          </w:p>
+        </w:tc>
+        <w:tc>
+          <w:tcPr>
+            <w:tcW w:w="1300" w:type="dxa"/>
+          </w:tcPr>
+          <w:p>
+            <w:pPr>
+              <w:spacing w:before="20" w:after="20"/>
+            </w:pPr>
+            <w:r>
+              <w:rPr>
+                <w:rFonts w:ascii="Calibri" w:hAnsi="Calibri" w:cs="Calibri"/>
+                <w:sz w:val="18"/>
+                <w:szCs w:val="18"/>
+              </w:rPr>
+              <w:t xml:space="preserve"/>
+            </w:r>
+          </w:p>
+        </w:tc>
+        <w:tc>
+          <w:tcPr>
+            <w:tcW w:w="2980" w:type="dxa"/>
+          </w:tcPr>
+          <w:p>
+            <w:pPr>
+              <w:spacing w:before="20" w:after="20"/>
+            </w:pPr>
+            <w:r>
+              <w:rPr>
+                <w:rFonts w:ascii="Calibri" w:hAnsi="Calibri" w:cs="Calibri"/>
+                <w:sz w:val="18"/>
+                <w:szCs w:val="18"/>
+              </w:rPr>
+              <w:t xml:space="preserve"/>
+            </w:r>
+          </w:p>
+        </w:tc>
+      </w:tr>
+      <w:tr>
+        <w:tc>
+          <w:tcPr>
+            <w:tcW w:w="4300" w:type="dxa"/>
+          </w:tcPr>
+          <w:p>
+            <w:pPr>
+              <w:spacing w:before="20" w:after="20"/>
+            </w:pPr>
+            <w:r>
+              <w:rPr>
+                <w:rFonts w:ascii="Calibri" w:hAnsi="Calibri" w:cs="Calibri"/>
+                <w:sz w:val="18"/>
+                <w:szCs w:val="18"/>
+              </w:rPr>
+              <w:t xml:space="preserve">EBITDA</w:t>
+            </w:r>
+          </w:p>
+        </w:tc>
+        <w:tc>
+          <w:tcPr>
+            <w:tcW w:w="900" w:type="dxa"/>
+          </w:tcPr>
+          <w:p>
+            <w:pPr>
+              <w:spacing w:before="20" w:after="20"/>
+            </w:pPr>
+            <w:r>
+              <w:rPr>
+                <w:rFonts w:ascii="Calibri" w:hAnsi="Calibri" w:cs="Calibri"/>
+                <w:sz w:val="18"/>
+                <w:szCs w:val="18"/>
+              </w:rPr>
+              <w:t xml:space="preserve">C21</w:t>
+            </w:r>
+          </w:p>
+        </w:tc>
+        <w:tc>
+          <w:tcPr>
+            <w:tcW w:w="900" w:type="dxa"/>
+          </w:tcPr>
+          <w:p>
+            <w:pPr>
+              <w:spacing w:before="20" w:after="20"/>
+            </w:pPr>
+            <w:r>
+              <w:rPr>
+                <w:rFonts w:ascii="Calibri" w:hAnsi="Calibri" w:cs="Calibri"/>
+                <w:sz w:val="18"/>
+                <w:szCs w:val="18"/>
+              </w:rPr>
+              <w:t xml:space="preserve">2024A</w:t>
+            </w:r>
+          </w:p>
+        </w:tc>
+        <w:tc>
+          <w:tcPr>
+            <w:tcW w:w="2000" w:type="dxa"/>
+          </w:tcPr>
+          <w:p>
+            <w:pPr>
+              <w:spacing w:before="20" w:after="20"/>
+            </w:pPr>
+            <w:r>
+              <w:rPr>
+                <w:rFonts w:ascii="Calibri" w:hAnsi="Calibri" w:cs="Calibri"/>
+                <w:sz w:val="18"/>
+                <w:szCs w:val="18"/>
+              </w:rPr>
+              <w:t xml:space="preserve">3,353.5</w:t>
+            </w:r>
+          </w:p>
+        </w:tc>
+        <w:tc>
+          <w:tcPr>
+            <w:tcW w:w="1300" w:type="dxa"/>
+          </w:tcPr>
+          <w:p>
+            <w:pPr>
+              <w:spacing w:before="20" w:after="20"/>
+            </w:pPr>
+            <w:r>
+              <w:rPr>
+                <w:rFonts w:ascii="Calibri" w:hAnsi="Calibri" w:cs="Calibri"/>
+                <w:sz w:val="18"/>
+                <w:szCs w:val="18"/>
+              </w:rPr>
+              <w:t xml:space="preserve"/>
+            </w:r>
+          </w:p>
+        </w:tc>
+        <w:tc>
+          <w:tcPr>
+            <w:tcW w:w="1300" w:type="dxa"/>
+          </w:tcPr>
+          <w:p>
+            <w:pPr>
+              <w:spacing w:before="20" w:after="20"/>
+            </w:pPr>
+            <w:r>
+              <w:rPr>
+                <w:rFonts w:ascii="Calibri" w:hAnsi="Calibri" w:cs="Calibri"/>
+                <w:sz w:val="18"/>
+                <w:szCs w:val="18"/>
+              </w:rPr>
+              <w:t xml:space="preserve"/>
+            </w:r>
+          </w:p>
+        </w:tc>
+        <w:tc>
+          <w:tcPr>
+            <w:tcW w:w="2980" w:type="dxa"/>
+          </w:tcPr>
+          <w:p>
+            <w:pPr>
+              <w:spacing w:before="20" w:after="20"/>
+            </w:pPr>
+            <w:r>
+              <w:rPr>
+                <w:rFonts w:ascii="Calibri" w:hAnsi="Calibri" w:cs="Calibri"/>
+                <w:sz w:val="18"/>
+                <w:szCs w:val="18"/>
+              </w:rPr>
+              <w:t xml:space="preserve"/>
+            </w:r>
+          </w:p>
+        </w:tc>
+      </w:tr>
+      <w:tr>
+        <w:tc>
+          <w:tcPr>
+            <w:tcW w:w="4300" w:type="dxa"/>
+          </w:tcPr>
+          <w:p>
+            <w:pPr>
+              <w:spacing w:before="20" w:after="20"/>
+            </w:pPr>
+            <w:r>
+              <w:rPr>
+                <w:rFonts w:ascii="Calibri" w:hAnsi="Calibri" w:cs="Calibri"/>
+                <w:sz w:val="18"/>
+                <w:szCs w:val="18"/>
+              </w:rPr>
+              <w:t xml:space="preserve">EBITDA</w:t>
+            </w:r>
+          </w:p>
+        </w:tc>
+        <w:tc>
+          <w:tcPr>
+            <w:tcW w:w="900" w:type="dxa"/>
+          </w:tcPr>
+          <w:p>
+            <w:pPr>
+              <w:spacing w:before="20" w:after="20"/>
+            </w:pPr>
+            <w:r>
+              <w:rPr>
+                <w:rFonts w:ascii="Calibri" w:hAnsi="Calibri" w:cs="Calibri"/>
+                <w:sz w:val="18"/>
+                <w:szCs w:val="18"/>
+              </w:rPr>
+              <w:t xml:space="preserve">D21</w:t>
+            </w:r>
+          </w:p>
+        </w:tc>
+        <w:tc>
+          <w:tcPr>
+            <w:tcW w:w="900" w:type="dxa"/>
+          </w:tcPr>
+          <w:p>
+            <w:pPr>
+              <w:spacing w:before="20" w:after="20"/>
+            </w:pPr>
+            <w:r>
+              <w:rPr>
+                <w:rFonts w:ascii="Calibri" w:hAnsi="Calibri" w:cs="Calibri"/>
+                <w:sz w:val="18"/>
+                <w:szCs w:val="18"/>
+              </w:rPr>
+              <w:t xml:space="preserve">2025A</w:t>
+            </w:r>
+          </w:p>
+        </w:tc>
+        <w:tc>
+          <w:tcPr>
+            <w:tcW w:w="2000" w:type="dxa"/>
+          </w:tcPr>
+          <w:p>
+            <w:pPr>
+              <w:spacing w:before="20" w:after="20"/>
+            </w:pPr>
+            <w:r>
+              <w:rPr>
+                <w:rFonts w:ascii="Calibri" w:hAnsi="Calibri" w:cs="Calibri"/>
+                <w:sz w:val="18"/>
+                <w:szCs w:val="18"/>
+              </w:rPr>
+              <w:t xml:space="preserve">1,945.2</w:t>
             </w:r>
           </w:p>
         </w:tc>
@@ -5012,7 +6036,7 @@
           <w:sz w:val="20"/>
           <w:szCs w:val="20"/>
         </w:rPr>
-        <w:t xml:space="preserve">Figures checked: ______ of 32.     Figures corrected: ______.</w:t>
+        <w:t xml:space="preserve">Figures checked: ______ of 40.     Figures corrected: ______.</w:t>
       </w:r>
     </w:p>
     <w:sectPr>

</xml_diff>

<commit_message>
Verification form filled: 38 of 38 filing figures match the FY2025 10-K with page numbers; markdown copy; AI Log rows
Co-Authored-By: Claude Fable 5.1 <noreply@anthropic.com>
</commit_message>
<xml_diff>
--- a/research/03 Drafts/Module 2 - Data verification.docx
+++ b/research/03 Drafts/Module 2 - Data verification.docx
@@ -40,7 +40,7 @@
           <w:sz w:val="20"/>
           <w:szCs w:val="20"/>
         </w:rPr>
-        <w:t xml:space="preserve">Filing checked: Forms 10-K for fiscal 2025 (accession 0001628280-26-008586), fiscal 2024 (0000047111-25-000014) and fiscal 2023 (0000047111-24-000009)</w:t>
+        <w:t xml:space="preserve">Filing checked: Form 10-K for fiscal 2025, accession 0001628280-26-008586 (it reports fiscal 2025, 2024 and 2023)</w:t>
       </w:r>
     </w:p>
     <w:p>
@@ -53,7 +53,7 @@
           <w:sz w:val="20"/>
           <w:szCs w:val="20"/>
         </w:rPr>
-        <w:t xml:space="preserve">Checked by: ____________________     Date: ______________</w:t>
+        <w:t xml:space="preserve">Checked by: Chris Lester     Date: 2026-10-04</w:t>
       </w:r>
     </w:p>
     <w:p>
@@ -351,25 +351,25 @@
                 <w:sz w:val="18"/>
                 <w:szCs w:val="18"/>
               </w:rPr>
-              <w:t xml:space="preserve"/>
-            </w:r>
-          </w:p>
-        </w:tc>
-        <w:tc>
-          <w:tcPr>
-            <w:tcW w:w="1300" w:type="dxa"/>
-          </w:tcPr>
-          <w:p>
-            <w:pPr>
-              <w:spacing w:before="20" w:after="20"/>
-            </w:pPr>
-            <w:r>
-              <w:rPr>
-                <w:rFonts w:ascii="Calibri" w:hAnsi="Calibri" w:cs="Calibri"/>
-                <w:sz w:val="18"/>
-                <w:szCs w:val="18"/>
-              </w:rPr>
-              <w:t xml:space="preserve"/>
+              <w:t xml:space="preserve">53</w:t>
+            </w:r>
+          </w:p>
+        </w:tc>
+        <w:tc>
+          <w:tcPr>
+            <w:tcW w:w="1300" w:type="dxa"/>
+          </w:tcPr>
+          <w:p>
+            <w:pPr>
+              <w:spacing w:before="20" w:after="20"/>
+            </w:pPr>
+            <w:r>
+              <w:rPr>
+                <w:rFonts w:ascii="Calibri" w:hAnsi="Calibri" w:cs="Calibri"/>
+                <w:sz w:val="18"/>
+                <w:szCs w:val="18"/>
+              </w:rPr>
+              <w:t xml:space="preserve">Y</w:t>
             </w:r>
           </w:p>
         </w:tc>
@@ -479,25 +479,25 @@
                 <w:sz w:val="18"/>
                 <w:szCs w:val="18"/>
               </w:rPr>
-              <w:t xml:space="preserve"/>
-            </w:r>
-          </w:p>
-        </w:tc>
-        <w:tc>
-          <w:tcPr>
-            <w:tcW w:w="1300" w:type="dxa"/>
-          </w:tcPr>
-          <w:p>
-            <w:pPr>
-              <w:spacing w:before="20" w:after="20"/>
-            </w:pPr>
-            <w:r>
-              <w:rPr>
-                <w:rFonts w:ascii="Calibri" w:hAnsi="Calibri" w:cs="Calibri"/>
-                <w:sz w:val="18"/>
-                <w:szCs w:val="18"/>
-              </w:rPr>
-              <w:t xml:space="preserve"/>
+              <w:t xml:space="preserve">53</w:t>
+            </w:r>
+          </w:p>
+        </w:tc>
+        <w:tc>
+          <w:tcPr>
+            <w:tcW w:w="1300" w:type="dxa"/>
+          </w:tcPr>
+          <w:p>
+            <w:pPr>
+              <w:spacing w:before="20" w:after="20"/>
+            </w:pPr>
+            <w:r>
+              <w:rPr>
+                <w:rFonts w:ascii="Calibri" w:hAnsi="Calibri" w:cs="Calibri"/>
+                <w:sz w:val="18"/>
+                <w:szCs w:val="18"/>
+              </w:rPr>
+              <w:t xml:space="preserve">Y</w:t>
             </w:r>
           </w:p>
         </w:tc>
@@ -607,25 +607,25 @@
                 <w:sz w:val="18"/>
                 <w:szCs w:val="18"/>
               </w:rPr>
-              <w:t xml:space="preserve"/>
-            </w:r>
-          </w:p>
-        </w:tc>
-        <w:tc>
-          <w:tcPr>
-            <w:tcW w:w="1300" w:type="dxa"/>
-          </w:tcPr>
-          <w:p>
-            <w:pPr>
-              <w:spacing w:before="20" w:after="20"/>
-            </w:pPr>
-            <w:r>
-              <w:rPr>
-                <w:rFonts w:ascii="Calibri" w:hAnsi="Calibri" w:cs="Calibri"/>
-                <w:sz w:val="18"/>
-                <w:szCs w:val="18"/>
-              </w:rPr>
-              <w:t xml:space="preserve"/>
+              <w:t xml:space="preserve">53</w:t>
+            </w:r>
+          </w:p>
+        </w:tc>
+        <w:tc>
+          <w:tcPr>
+            <w:tcW w:w="1300" w:type="dxa"/>
+          </w:tcPr>
+          <w:p>
+            <w:pPr>
+              <w:spacing w:before="20" w:after="20"/>
+            </w:pPr>
+            <w:r>
+              <w:rPr>
+                <w:rFonts w:ascii="Calibri" w:hAnsi="Calibri" w:cs="Calibri"/>
+                <w:sz w:val="18"/>
+                <w:szCs w:val="18"/>
+              </w:rPr>
+              <w:t xml:space="preserve">Y</w:t>
             </w:r>
           </w:p>
         </w:tc>
@@ -735,25 +735,25 @@
                 <w:sz w:val="18"/>
                 <w:szCs w:val="18"/>
               </w:rPr>
-              <w:t xml:space="preserve"/>
-            </w:r>
-          </w:p>
-        </w:tc>
-        <w:tc>
-          <w:tcPr>
-            <w:tcW w:w="1300" w:type="dxa"/>
-          </w:tcPr>
-          <w:p>
-            <w:pPr>
-              <w:spacing w:before="20" w:after="20"/>
-            </w:pPr>
-            <w:r>
-              <w:rPr>
-                <w:rFonts w:ascii="Calibri" w:hAnsi="Calibri" w:cs="Calibri"/>
-                <w:sz w:val="18"/>
-                <w:szCs w:val="18"/>
-              </w:rPr>
-              <w:t xml:space="preserve"/>
+              <w:t xml:space="preserve">53</w:t>
+            </w:r>
+          </w:p>
+        </w:tc>
+        <w:tc>
+          <w:tcPr>
+            <w:tcW w:w="1300" w:type="dxa"/>
+          </w:tcPr>
+          <w:p>
+            <w:pPr>
+              <w:spacing w:before="20" w:after="20"/>
+            </w:pPr>
+            <w:r>
+              <w:rPr>
+                <w:rFonts w:ascii="Calibri" w:hAnsi="Calibri" w:cs="Calibri"/>
+                <w:sz w:val="18"/>
+                <w:szCs w:val="18"/>
+              </w:rPr>
+              <w:t xml:space="preserve">Y</w:t>
             </w:r>
           </w:p>
         </w:tc>
@@ -863,25 +863,25 @@
                 <w:sz w:val="18"/>
                 <w:szCs w:val="18"/>
               </w:rPr>
-              <w:t xml:space="preserve"/>
-            </w:r>
-          </w:p>
-        </w:tc>
-        <w:tc>
-          <w:tcPr>
-            <w:tcW w:w="1300" w:type="dxa"/>
-          </w:tcPr>
-          <w:p>
-            <w:pPr>
-              <w:spacing w:before="20" w:after="20"/>
-            </w:pPr>
-            <w:r>
-              <w:rPr>
-                <w:rFonts w:ascii="Calibri" w:hAnsi="Calibri" w:cs="Calibri"/>
-                <w:sz w:val="18"/>
-                <w:szCs w:val="18"/>
-              </w:rPr>
-              <w:t xml:space="preserve"/>
+              <w:t xml:space="preserve">53</w:t>
+            </w:r>
+          </w:p>
+        </w:tc>
+        <w:tc>
+          <w:tcPr>
+            <w:tcW w:w="1300" w:type="dxa"/>
+          </w:tcPr>
+          <w:p>
+            <w:pPr>
+              <w:spacing w:before="20" w:after="20"/>
+            </w:pPr>
+            <w:r>
+              <w:rPr>
+                <w:rFonts w:ascii="Calibri" w:hAnsi="Calibri" w:cs="Calibri"/>
+                <w:sz w:val="18"/>
+                <w:szCs w:val="18"/>
+              </w:rPr>
+              <w:t xml:space="preserve">Y</w:t>
             </w:r>
           </w:p>
         </w:tc>
@@ -991,25 +991,25 @@
                 <w:sz w:val="18"/>
                 <w:szCs w:val="18"/>
               </w:rPr>
-              <w:t xml:space="preserve"/>
-            </w:r>
-          </w:p>
-        </w:tc>
-        <w:tc>
-          <w:tcPr>
-            <w:tcW w:w="1300" w:type="dxa"/>
-          </w:tcPr>
-          <w:p>
-            <w:pPr>
-              <w:spacing w:before="20" w:after="20"/>
-            </w:pPr>
-            <w:r>
-              <w:rPr>
-                <w:rFonts w:ascii="Calibri" w:hAnsi="Calibri" w:cs="Calibri"/>
-                <w:sz w:val="18"/>
-                <w:szCs w:val="18"/>
-              </w:rPr>
-              <w:t xml:space="preserve"/>
+              <w:t xml:space="preserve">53</w:t>
+            </w:r>
+          </w:p>
+        </w:tc>
+        <w:tc>
+          <w:tcPr>
+            <w:tcW w:w="1300" w:type="dxa"/>
+          </w:tcPr>
+          <w:p>
+            <w:pPr>
+              <w:spacing w:before="20" w:after="20"/>
+            </w:pPr>
+            <w:r>
+              <w:rPr>
+                <w:rFonts w:ascii="Calibri" w:hAnsi="Calibri" w:cs="Calibri"/>
+                <w:sz w:val="18"/>
+                <w:szCs w:val="18"/>
+              </w:rPr>
+              <w:t xml:space="preserve">Y</w:t>
             </w:r>
           </w:p>
         </w:tc>
@@ -1119,25 +1119,25 @@
                 <w:sz w:val="18"/>
                 <w:szCs w:val="18"/>
               </w:rPr>
-              <w:t xml:space="preserve"/>
-            </w:r>
-          </w:p>
-        </w:tc>
-        <w:tc>
-          <w:tcPr>
-            <w:tcW w:w="1300" w:type="dxa"/>
-          </w:tcPr>
-          <w:p>
-            <w:pPr>
-              <w:spacing w:before="20" w:after="20"/>
-            </w:pPr>
-            <w:r>
-              <w:rPr>
-                <w:rFonts w:ascii="Calibri" w:hAnsi="Calibri" w:cs="Calibri"/>
-                <w:sz w:val="18"/>
-                <w:szCs w:val="18"/>
-              </w:rPr>
-              <w:t xml:space="preserve"/>
+              <w:t xml:space="preserve">53</w:t>
+            </w:r>
+          </w:p>
+        </w:tc>
+        <w:tc>
+          <w:tcPr>
+            <w:tcW w:w="1300" w:type="dxa"/>
+          </w:tcPr>
+          <w:p>
+            <w:pPr>
+              <w:spacing w:before="20" w:after="20"/>
+            </w:pPr>
+            <w:r>
+              <w:rPr>
+                <w:rFonts w:ascii="Calibri" w:hAnsi="Calibri" w:cs="Calibri"/>
+                <w:sz w:val="18"/>
+                <w:szCs w:val="18"/>
+              </w:rPr>
+              <w:t xml:space="preserve">Y</w:t>
             </w:r>
           </w:p>
         </w:tc>
@@ -1247,25 +1247,25 @@
                 <w:sz w:val="18"/>
                 <w:szCs w:val="18"/>
               </w:rPr>
-              <w:t xml:space="preserve"/>
-            </w:r>
-          </w:p>
-        </w:tc>
-        <w:tc>
-          <w:tcPr>
-            <w:tcW w:w="1300" w:type="dxa"/>
-          </w:tcPr>
-          <w:p>
-            <w:pPr>
-              <w:spacing w:before="20" w:after="20"/>
-            </w:pPr>
-            <w:r>
-              <w:rPr>
-                <w:rFonts w:ascii="Calibri" w:hAnsi="Calibri" w:cs="Calibri"/>
-                <w:sz w:val="18"/>
-                <w:szCs w:val="18"/>
-              </w:rPr>
-              <w:t xml:space="preserve"/>
+              <w:t xml:space="preserve">53</w:t>
+            </w:r>
+          </w:p>
+        </w:tc>
+        <w:tc>
+          <w:tcPr>
+            <w:tcW w:w="1300" w:type="dxa"/>
+          </w:tcPr>
+          <w:p>
+            <w:pPr>
+              <w:spacing w:before="20" w:after="20"/>
+            </w:pPr>
+            <w:r>
+              <w:rPr>
+                <w:rFonts w:ascii="Calibri" w:hAnsi="Calibri" w:cs="Calibri"/>
+                <w:sz w:val="18"/>
+                <w:szCs w:val="18"/>
+              </w:rPr>
+              <w:t xml:space="preserve">Y</w:t>
             </w:r>
           </w:p>
         </w:tc>
@@ -1375,25 +1375,25 @@
                 <w:sz w:val="18"/>
                 <w:szCs w:val="18"/>
               </w:rPr>
-              <w:t xml:space="preserve"/>
-            </w:r>
-          </w:p>
-        </w:tc>
-        <w:tc>
-          <w:tcPr>
-            <w:tcW w:w="1300" w:type="dxa"/>
-          </w:tcPr>
-          <w:p>
-            <w:pPr>
-              <w:spacing w:before="20" w:after="20"/>
-            </w:pPr>
-            <w:r>
-              <w:rPr>
-                <w:rFonts w:ascii="Calibri" w:hAnsi="Calibri" w:cs="Calibri"/>
-                <w:sz w:val="18"/>
-                <w:szCs w:val="18"/>
-              </w:rPr>
-              <w:t xml:space="preserve"/>
+              <w:t xml:space="preserve">97</w:t>
+            </w:r>
+          </w:p>
+        </w:tc>
+        <w:tc>
+          <w:tcPr>
+            <w:tcW w:w="1300" w:type="dxa"/>
+          </w:tcPr>
+          <w:p>
+            <w:pPr>
+              <w:spacing w:before="20" w:after="20"/>
+            </w:pPr>
+            <w:r>
+              <w:rPr>
+                <w:rFonts w:ascii="Calibri" w:hAnsi="Calibri" w:cs="Calibri"/>
+                <w:sz w:val="18"/>
+                <w:szCs w:val="18"/>
+              </w:rPr>
+              <w:t xml:space="preserve">Y</w:t>
             </w:r>
           </w:p>
         </w:tc>
@@ -1503,25 +1503,25 @@
                 <w:sz w:val="18"/>
                 <w:szCs w:val="18"/>
               </w:rPr>
-              <w:t xml:space="preserve"/>
-            </w:r>
-          </w:p>
-        </w:tc>
-        <w:tc>
-          <w:tcPr>
-            <w:tcW w:w="1300" w:type="dxa"/>
-          </w:tcPr>
-          <w:p>
-            <w:pPr>
-              <w:spacing w:before="20" w:after="20"/>
-            </w:pPr>
-            <w:r>
-              <w:rPr>
-                <w:rFonts w:ascii="Calibri" w:hAnsi="Calibri" w:cs="Calibri"/>
-                <w:sz w:val="18"/>
-                <w:szCs w:val="18"/>
-              </w:rPr>
-              <w:t xml:space="preserve"/>
+              <w:t xml:space="preserve">97</w:t>
+            </w:r>
+          </w:p>
+        </w:tc>
+        <w:tc>
+          <w:tcPr>
+            <w:tcW w:w="1300" w:type="dxa"/>
+          </w:tcPr>
+          <w:p>
+            <w:pPr>
+              <w:spacing w:before="20" w:after="20"/>
+            </w:pPr>
+            <w:r>
+              <w:rPr>
+                <w:rFonts w:ascii="Calibri" w:hAnsi="Calibri" w:cs="Calibri"/>
+                <w:sz w:val="18"/>
+                <w:szCs w:val="18"/>
+              </w:rPr>
+              <w:t xml:space="preserve">Y</w:t>
             </w:r>
           </w:p>
         </w:tc>
@@ -1840,25 +1840,25 @@
                 <w:sz w:val="18"/>
                 <w:szCs w:val="18"/>
               </w:rPr>
-              <w:t xml:space="preserve"/>
-            </w:r>
-          </w:p>
-        </w:tc>
-        <w:tc>
-          <w:tcPr>
-            <w:tcW w:w="1300" w:type="dxa"/>
-          </w:tcPr>
-          <w:p>
-            <w:pPr>
-              <w:spacing w:before="20" w:after="20"/>
-            </w:pPr>
-            <w:r>
-              <w:rPr>
-                <w:rFonts w:ascii="Calibri" w:hAnsi="Calibri" w:cs="Calibri"/>
-                <w:sz w:val="18"/>
-                <w:szCs w:val="18"/>
-              </w:rPr>
-              <w:t xml:space="preserve"/>
+              <w:t xml:space="preserve">53</w:t>
+            </w:r>
+          </w:p>
+        </w:tc>
+        <w:tc>
+          <w:tcPr>
+            <w:tcW w:w="1300" w:type="dxa"/>
+          </w:tcPr>
+          <w:p>
+            <w:pPr>
+              <w:spacing w:before="20" w:after="20"/>
+            </w:pPr>
+            <w:r>
+              <w:rPr>
+                <w:rFonts w:ascii="Calibri" w:hAnsi="Calibri" w:cs="Calibri"/>
+                <w:sz w:val="18"/>
+                <w:szCs w:val="18"/>
+              </w:rPr>
+              <w:t xml:space="preserve">Y</w:t>
             </w:r>
           </w:p>
         </w:tc>
@@ -1968,25 +1968,25 @@
                 <w:sz w:val="18"/>
                 <w:szCs w:val="18"/>
               </w:rPr>
-              <w:t xml:space="preserve"/>
-            </w:r>
-          </w:p>
-        </w:tc>
-        <w:tc>
-          <w:tcPr>
-            <w:tcW w:w="1300" w:type="dxa"/>
-          </w:tcPr>
-          <w:p>
-            <w:pPr>
-              <w:spacing w:before="20" w:after="20"/>
-            </w:pPr>
-            <w:r>
-              <w:rPr>
-                <w:rFonts w:ascii="Calibri" w:hAnsi="Calibri" w:cs="Calibri"/>
-                <w:sz w:val="18"/>
-                <w:szCs w:val="18"/>
-              </w:rPr>
-              <w:t xml:space="preserve"/>
+              <w:t xml:space="preserve">53</w:t>
+            </w:r>
+          </w:p>
+        </w:tc>
+        <w:tc>
+          <w:tcPr>
+            <w:tcW w:w="1300" w:type="dxa"/>
+          </w:tcPr>
+          <w:p>
+            <w:pPr>
+              <w:spacing w:before="20" w:after="20"/>
+            </w:pPr>
+            <w:r>
+              <w:rPr>
+                <w:rFonts w:ascii="Calibri" w:hAnsi="Calibri" w:cs="Calibri"/>
+                <w:sz w:val="18"/>
+                <w:szCs w:val="18"/>
+              </w:rPr>
+              <w:t xml:space="preserve">Y</w:t>
             </w:r>
           </w:p>
         </w:tc>
@@ -2096,25 +2096,25 @@
                 <w:sz w:val="18"/>
                 <w:szCs w:val="18"/>
               </w:rPr>
-              <w:t xml:space="preserve"/>
-            </w:r>
-          </w:p>
-        </w:tc>
-        <w:tc>
-          <w:tcPr>
-            <w:tcW w:w="1300" w:type="dxa"/>
-          </w:tcPr>
-          <w:p>
-            <w:pPr>
-              <w:spacing w:before="20" w:after="20"/>
-            </w:pPr>
-            <w:r>
-              <w:rPr>
-                <w:rFonts w:ascii="Calibri" w:hAnsi="Calibri" w:cs="Calibri"/>
-                <w:sz w:val="18"/>
-                <w:szCs w:val="18"/>
-              </w:rPr>
-              <w:t xml:space="preserve"/>
+              <w:t xml:space="preserve">53</w:t>
+            </w:r>
+          </w:p>
+        </w:tc>
+        <w:tc>
+          <w:tcPr>
+            <w:tcW w:w="1300" w:type="dxa"/>
+          </w:tcPr>
+          <w:p>
+            <w:pPr>
+              <w:spacing w:before="20" w:after="20"/>
+            </w:pPr>
+            <w:r>
+              <w:rPr>
+                <w:rFonts w:ascii="Calibri" w:hAnsi="Calibri" w:cs="Calibri"/>
+                <w:sz w:val="18"/>
+                <w:szCs w:val="18"/>
+              </w:rPr>
+              <w:t xml:space="preserve">Y</w:t>
             </w:r>
           </w:p>
         </w:tc>
@@ -2224,25 +2224,25 @@
                 <w:sz w:val="18"/>
                 <w:szCs w:val="18"/>
               </w:rPr>
-              <w:t xml:space="preserve"/>
-            </w:r>
-          </w:p>
-        </w:tc>
-        <w:tc>
-          <w:tcPr>
-            <w:tcW w:w="1300" w:type="dxa"/>
-          </w:tcPr>
-          <w:p>
-            <w:pPr>
-              <w:spacing w:before="20" w:after="20"/>
-            </w:pPr>
-            <w:r>
-              <w:rPr>
-                <w:rFonts w:ascii="Calibri" w:hAnsi="Calibri" w:cs="Calibri"/>
-                <w:sz w:val="18"/>
-                <w:szCs w:val="18"/>
-              </w:rPr>
-              <w:t xml:space="preserve"/>
+              <w:t xml:space="preserve">53</w:t>
+            </w:r>
+          </w:p>
+        </w:tc>
+        <w:tc>
+          <w:tcPr>
+            <w:tcW w:w="1300" w:type="dxa"/>
+          </w:tcPr>
+          <w:p>
+            <w:pPr>
+              <w:spacing w:before="20" w:after="20"/>
+            </w:pPr>
+            <w:r>
+              <w:rPr>
+                <w:rFonts w:ascii="Calibri" w:hAnsi="Calibri" w:cs="Calibri"/>
+                <w:sz w:val="18"/>
+                <w:szCs w:val="18"/>
+              </w:rPr>
+              <w:t xml:space="preserve">Y</w:t>
             </w:r>
           </w:p>
         </w:tc>
@@ -2352,25 +2352,25 @@
                 <w:sz w:val="18"/>
                 <w:szCs w:val="18"/>
               </w:rPr>
-              <w:t xml:space="preserve"/>
-            </w:r>
-          </w:p>
-        </w:tc>
-        <w:tc>
-          <w:tcPr>
-            <w:tcW w:w="1300" w:type="dxa"/>
-          </w:tcPr>
-          <w:p>
-            <w:pPr>
-              <w:spacing w:before="20" w:after="20"/>
-            </w:pPr>
-            <w:r>
-              <w:rPr>
-                <w:rFonts w:ascii="Calibri" w:hAnsi="Calibri" w:cs="Calibri"/>
-                <w:sz w:val="18"/>
-                <w:szCs w:val="18"/>
-              </w:rPr>
-              <w:t xml:space="preserve"/>
+              <w:t xml:space="preserve">53</w:t>
+            </w:r>
+          </w:p>
+        </w:tc>
+        <w:tc>
+          <w:tcPr>
+            <w:tcW w:w="1300" w:type="dxa"/>
+          </w:tcPr>
+          <w:p>
+            <w:pPr>
+              <w:spacing w:before="20" w:after="20"/>
+            </w:pPr>
+            <w:r>
+              <w:rPr>
+                <w:rFonts w:ascii="Calibri" w:hAnsi="Calibri" w:cs="Calibri"/>
+                <w:sz w:val="18"/>
+                <w:szCs w:val="18"/>
+              </w:rPr>
+              <w:t xml:space="preserve">Y</w:t>
             </w:r>
           </w:p>
         </w:tc>
@@ -2480,25 +2480,25 @@
                 <w:sz w:val="18"/>
                 <w:szCs w:val="18"/>
               </w:rPr>
-              <w:t xml:space="preserve"/>
-            </w:r>
-          </w:p>
-        </w:tc>
-        <w:tc>
-          <w:tcPr>
-            <w:tcW w:w="1300" w:type="dxa"/>
-          </w:tcPr>
-          <w:p>
-            <w:pPr>
-              <w:spacing w:before="20" w:after="20"/>
-            </w:pPr>
-            <w:r>
-              <w:rPr>
-                <w:rFonts w:ascii="Calibri" w:hAnsi="Calibri" w:cs="Calibri"/>
-                <w:sz w:val="18"/>
-                <w:szCs w:val="18"/>
-              </w:rPr>
-              <w:t xml:space="preserve"/>
+              <w:t xml:space="preserve">53</w:t>
+            </w:r>
+          </w:p>
+        </w:tc>
+        <w:tc>
+          <w:tcPr>
+            <w:tcW w:w="1300" w:type="dxa"/>
+          </w:tcPr>
+          <w:p>
+            <w:pPr>
+              <w:spacing w:before="20" w:after="20"/>
+            </w:pPr>
+            <w:r>
+              <w:rPr>
+                <w:rFonts w:ascii="Calibri" w:hAnsi="Calibri" w:cs="Calibri"/>
+                <w:sz w:val="18"/>
+                <w:szCs w:val="18"/>
+              </w:rPr>
+              <w:t xml:space="preserve">Y</w:t>
             </w:r>
           </w:p>
         </w:tc>
@@ -2608,25 +2608,25 @@
                 <w:sz w:val="18"/>
                 <w:szCs w:val="18"/>
               </w:rPr>
-              <w:t xml:space="preserve"/>
-            </w:r>
-          </w:p>
-        </w:tc>
-        <w:tc>
-          <w:tcPr>
-            <w:tcW w:w="1300" w:type="dxa"/>
-          </w:tcPr>
-          <w:p>
-            <w:pPr>
-              <w:spacing w:before="20" w:after="20"/>
-            </w:pPr>
-            <w:r>
-              <w:rPr>
-                <w:rFonts w:ascii="Calibri" w:hAnsi="Calibri" w:cs="Calibri"/>
-                <w:sz w:val="18"/>
-                <w:szCs w:val="18"/>
-              </w:rPr>
-              <w:t xml:space="preserve"/>
+              <w:t xml:space="preserve">53</w:t>
+            </w:r>
+          </w:p>
+        </w:tc>
+        <w:tc>
+          <w:tcPr>
+            <w:tcW w:w="1300" w:type="dxa"/>
+          </w:tcPr>
+          <w:p>
+            <w:pPr>
+              <w:spacing w:before="20" w:after="20"/>
+            </w:pPr>
+            <w:r>
+              <w:rPr>
+                <w:rFonts w:ascii="Calibri" w:hAnsi="Calibri" w:cs="Calibri"/>
+                <w:sz w:val="18"/>
+                <w:szCs w:val="18"/>
+              </w:rPr>
+              <w:t xml:space="preserve">Y</w:t>
             </w:r>
           </w:p>
         </w:tc>
@@ -2736,25 +2736,25 @@
                 <w:sz w:val="18"/>
                 <w:szCs w:val="18"/>
               </w:rPr>
-              <w:t xml:space="preserve"/>
-            </w:r>
-          </w:p>
-        </w:tc>
-        <w:tc>
-          <w:tcPr>
-            <w:tcW w:w="1300" w:type="dxa"/>
-          </w:tcPr>
-          <w:p>
-            <w:pPr>
-              <w:spacing w:before="20" w:after="20"/>
-            </w:pPr>
-            <w:r>
-              <w:rPr>
-                <w:rFonts w:ascii="Calibri" w:hAnsi="Calibri" w:cs="Calibri"/>
-                <w:sz w:val="18"/>
-                <w:szCs w:val="18"/>
-              </w:rPr>
-              <w:t xml:space="preserve"/>
+              <w:t xml:space="preserve">53</w:t>
+            </w:r>
+          </w:p>
+        </w:tc>
+        <w:tc>
+          <w:tcPr>
+            <w:tcW w:w="1300" w:type="dxa"/>
+          </w:tcPr>
+          <w:p>
+            <w:pPr>
+              <w:spacing w:before="20" w:after="20"/>
+            </w:pPr>
+            <w:r>
+              <w:rPr>
+                <w:rFonts w:ascii="Calibri" w:hAnsi="Calibri" w:cs="Calibri"/>
+                <w:sz w:val="18"/>
+                <w:szCs w:val="18"/>
+              </w:rPr>
+              <w:t xml:space="preserve">Y</w:t>
             </w:r>
           </w:p>
         </w:tc>
@@ -2864,25 +2864,25 @@
                 <w:sz w:val="18"/>
                 <w:szCs w:val="18"/>
               </w:rPr>
-              <w:t xml:space="preserve"/>
-            </w:r>
-          </w:p>
-        </w:tc>
-        <w:tc>
-          <w:tcPr>
-            <w:tcW w:w="1300" w:type="dxa"/>
-          </w:tcPr>
-          <w:p>
-            <w:pPr>
-              <w:spacing w:before="20" w:after="20"/>
-            </w:pPr>
-            <w:r>
-              <w:rPr>
-                <w:rFonts w:ascii="Calibri" w:hAnsi="Calibri" w:cs="Calibri"/>
-                <w:sz w:val="18"/>
-                <w:szCs w:val="18"/>
-              </w:rPr>
-              <w:t xml:space="preserve"/>
+              <w:t xml:space="preserve">53</w:t>
+            </w:r>
+          </w:p>
+        </w:tc>
+        <w:tc>
+          <w:tcPr>
+            <w:tcW w:w="1300" w:type="dxa"/>
+          </w:tcPr>
+          <w:p>
+            <w:pPr>
+              <w:spacing w:before="20" w:after="20"/>
+            </w:pPr>
+            <w:r>
+              <w:rPr>
+                <w:rFonts w:ascii="Calibri" w:hAnsi="Calibri" w:cs="Calibri"/>
+                <w:sz w:val="18"/>
+                <w:szCs w:val="18"/>
+              </w:rPr>
+              <w:t xml:space="preserve">Y</w:t>
             </w:r>
           </w:p>
         </w:tc>
@@ -2992,25 +2992,25 @@
                 <w:sz w:val="18"/>
                 <w:szCs w:val="18"/>
               </w:rPr>
-              <w:t xml:space="preserve"/>
-            </w:r>
-          </w:p>
-        </w:tc>
-        <w:tc>
-          <w:tcPr>
-            <w:tcW w:w="1300" w:type="dxa"/>
-          </w:tcPr>
-          <w:p>
-            <w:pPr>
-              <w:spacing w:before="20" w:after="20"/>
-            </w:pPr>
-            <w:r>
-              <w:rPr>
-                <w:rFonts w:ascii="Calibri" w:hAnsi="Calibri" w:cs="Calibri"/>
-                <w:sz w:val="18"/>
-                <w:szCs w:val="18"/>
-              </w:rPr>
-              <w:t xml:space="preserve"/>
+              <w:t xml:space="preserve">53</w:t>
+            </w:r>
+          </w:p>
+        </w:tc>
+        <w:tc>
+          <w:tcPr>
+            <w:tcW w:w="1300" w:type="dxa"/>
+          </w:tcPr>
+          <w:p>
+            <w:pPr>
+              <w:spacing w:before="20" w:after="20"/>
+            </w:pPr>
+            <w:r>
+              <w:rPr>
+                <w:rFonts w:ascii="Calibri" w:hAnsi="Calibri" w:cs="Calibri"/>
+                <w:sz w:val="18"/>
+                <w:szCs w:val="18"/>
+              </w:rPr>
+              <w:t xml:space="preserve">Y</w:t>
             </w:r>
           </w:p>
         </w:tc>
@@ -3120,25 +3120,25 @@
                 <w:sz w:val="18"/>
                 <w:szCs w:val="18"/>
               </w:rPr>
-              <w:t xml:space="preserve"/>
-            </w:r>
-          </w:p>
-        </w:tc>
-        <w:tc>
-          <w:tcPr>
-            <w:tcW w:w="1300" w:type="dxa"/>
-          </w:tcPr>
-          <w:p>
-            <w:pPr>
-              <w:spacing w:before="20" w:after="20"/>
-            </w:pPr>
-            <w:r>
-              <w:rPr>
-                <w:rFonts w:ascii="Calibri" w:hAnsi="Calibri" w:cs="Calibri"/>
-                <w:sz w:val="18"/>
-                <w:szCs w:val="18"/>
-              </w:rPr>
-              <w:t xml:space="preserve"/>
+              <w:t xml:space="preserve">53</w:t>
+            </w:r>
+          </w:p>
+        </w:tc>
+        <w:tc>
+          <w:tcPr>
+            <w:tcW w:w="1300" w:type="dxa"/>
+          </w:tcPr>
+          <w:p>
+            <w:pPr>
+              <w:spacing w:before="20" w:after="20"/>
+            </w:pPr>
+            <w:r>
+              <w:rPr>
+                <w:rFonts w:ascii="Calibri" w:hAnsi="Calibri" w:cs="Calibri"/>
+                <w:sz w:val="18"/>
+                <w:szCs w:val="18"/>
+              </w:rPr>
+              <w:t xml:space="preserve">Y</w:t>
             </w:r>
           </w:p>
         </w:tc>
@@ -3248,25 +3248,25 @@
                 <w:sz w:val="18"/>
                 <w:szCs w:val="18"/>
               </w:rPr>
-              <w:t xml:space="preserve"/>
-            </w:r>
-          </w:p>
-        </w:tc>
-        <w:tc>
-          <w:tcPr>
-            <w:tcW w:w="1300" w:type="dxa"/>
-          </w:tcPr>
-          <w:p>
-            <w:pPr>
-              <w:spacing w:before="20" w:after="20"/>
-            </w:pPr>
-            <w:r>
-              <w:rPr>
-                <w:rFonts w:ascii="Calibri" w:hAnsi="Calibri" w:cs="Calibri"/>
-                <w:sz w:val="18"/>
-                <w:szCs w:val="18"/>
-              </w:rPr>
-              <w:t xml:space="preserve"/>
+              <w:t xml:space="preserve">53</w:t>
+            </w:r>
+          </w:p>
+        </w:tc>
+        <w:tc>
+          <w:tcPr>
+            <w:tcW w:w="1300" w:type="dxa"/>
+          </w:tcPr>
+          <w:p>
+            <w:pPr>
+              <w:spacing w:before="20" w:after="20"/>
+            </w:pPr>
+            <w:r>
+              <w:rPr>
+                <w:rFonts w:ascii="Calibri" w:hAnsi="Calibri" w:cs="Calibri"/>
+                <w:sz w:val="18"/>
+                <w:szCs w:val="18"/>
+              </w:rPr>
+              <w:t xml:space="preserve">Y</w:t>
             </w:r>
           </w:p>
         </w:tc>
@@ -3376,25 +3376,25 @@
                 <w:sz w:val="18"/>
                 <w:szCs w:val="18"/>
               </w:rPr>
-              <w:t xml:space="preserve"/>
-            </w:r>
-          </w:p>
-        </w:tc>
-        <w:tc>
-          <w:tcPr>
-            <w:tcW w:w="1300" w:type="dxa"/>
-          </w:tcPr>
-          <w:p>
-            <w:pPr>
-              <w:spacing w:before="20" w:after="20"/>
-            </w:pPr>
-            <w:r>
-              <w:rPr>
-                <w:rFonts w:ascii="Calibri" w:hAnsi="Calibri" w:cs="Calibri"/>
-                <w:sz w:val="18"/>
-                <w:szCs w:val="18"/>
-              </w:rPr>
-              <w:t xml:space="preserve"/>
+              <w:t xml:space="preserve">n/a</w:t>
+            </w:r>
+          </w:p>
+        </w:tc>
+        <w:tc>
+          <w:tcPr>
+            <w:tcW w:w="1300" w:type="dxa"/>
+          </w:tcPr>
+          <w:p>
+            <w:pPr>
+              <w:spacing w:before="20" w:after="20"/>
+            </w:pPr>
+            <w:r>
+              <w:rPr>
+                <w:rFonts w:ascii="Calibri" w:hAnsi="Calibri" w:cs="Calibri"/>
+                <w:sz w:val="18"/>
+                <w:szCs w:val="18"/>
+              </w:rPr>
+              <w:t xml:space="preserve">n/a</w:t>
             </w:r>
           </w:p>
         </w:tc>
@@ -3412,7 +3412,7 @@
                 <w:sz w:val="18"/>
                 <w:szCs w:val="18"/>
               </w:rPr>
-              <w:t xml:space="preserve"/>
+              <w:t xml:space="preserve">Not in the filing. Derived: EBIT plus D&amp;A</w:t>
             </w:r>
           </w:p>
         </w:tc>
@@ -3504,25 +3504,25 @@
                 <w:sz w:val="18"/>
                 <w:szCs w:val="18"/>
               </w:rPr>
-              <w:t xml:space="preserve"/>
-            </w:r>
-          </w:p>
-        </w:tc>
-        <w:tc>
-          <w:tcPr>
-            <w:tcW w:w="1300" w:type="dxa"/>
-          </w:tcPr>
-          <w:p>
-            <w:pPr>
-              <w:spacing w:before="20" w:after="20"/>
-            </w:pPr>
-            <w:r>
-              <w:rPr>
-                <w:rFonts w:ascii="Calibri" w:hAnsi="Calibri" w:cs="Calibri"/>
-                <w:sz w:val="18"/>
-                <w:szCs w:val="18"/>
-              </w:rPr>
-              <w:t xml:space="preserve"/>
+              <w:t xml:space="preserve">n/a</w:t>
+            </w:r>
+          </w:p>
+        </w:tc>
+        <w:tc>
+          <w:tcPr>
+            <w:tcW w:w="1300" w:type="dxa"/>
+          </w:tcPr>
+          <w:p>
+            <w:pPr>
+              <w:spacing w:before="20" w:after="20"/>
+            </w:pPr>
+            <w:r>
+              <w:rPr>
+                <w:rFonts w:ascii="Calibri" w:hAnsi="Calibri" w:cs="Calibri"/>
+                <w:sz w:val="18"/>
+                <w:szCs w:val="18"/>
+              </w:rPr>
+              <w:t xml:space="preserve">n/a</w:t>
             </w:r>
           </w:p>
         </w:tc>
@@ -3540,7 +3540,7 @@
                 <w:sz w:val="18"/>
                 <w:szCs w:val="18"/>
               </w:rPr>
-              <w:t xml:space="preserve"/>
+              <w:t xml:space="preserve">Not in the filing. Derived: EBIT plus D&amp;A</w:t>
             </w:r>
           </w:p>
         </w:tc>
@@ -3841,25 +3841,25 @@
                 <w:sz w:val="18"/>
                 <w:szCs w:val="18"/>
               </w:rPr>
-              <w:t xml:space="preserve"/>
-            </w:r>
-          </w:p>
-        </w:tc>
-        <w:tc>
-          <w:tcPr>
-            <w:tcW w:w="1300" w:type="dxa"/>
-          </w:tcPr>
-          <w:p>
-            <w:pPr>
-              <w:spacing w:before="20" w:after="20"/>
-            </w:pPr>
-            <w:r>
-              <w:rPr>
-                <w:rFonts w:ascii="Calibri" w:hAnsi="Calibri" w:cs="Calibri"/>
-                <w:sz w:val="18"/>
-                <w:szCs w:val="18"/>
-              </w:rPr>
-              <w:t xml:space="preserve"/>
+              <w:t xml:space="preserve">55</w:t>
+            </w:r>
+          </w:p>
+        </w:tc>
+        <w:tc>
+          <w:tcPr>
+            <w:tcW w:w="1300" w:type="dxa"/>
+          </w:tcPr>
+          <w:p>
+            <w:pPr>
+              <w:spacing w:before="20" w:after="20"/>
+            </w:pPr>
+            <w:r>
+              <w:rPr>
+                <w:rFonts w:ascii="Calibri" w:hAnsi="Calibri" w:cs="Calibri"/>
+                <w:sz w:val="18"/>
+                <w:szCs w:val="18"/>
+              </w:rPr>
+              <w:t xml:space="preserve">Y</w:t>
             </w:r>
           </w:p>
         </w:tc>
@@ -3969,25 +3969,25 @@
                 <w:sz w:val="18"/>
                 <w:szCs w:val="18"/>
               </w:rPr>
-              <w:t xml:space="preserve"/>
-            </w:r>
-          </w:p>
-        </w:tc>
-        <w:tc>
-          <w:tcPr>
-            <w:tcW w:w="1300" w:type="dxa"/>
-          </w:tcPr>
-          <w:p>
-            <w:pPr>
-              <w:spacing w:before="20" w:after="20"/>
-            </w:pPr>
-            <w:r>
-              <w:rPr>
-                <w:rFonts w:ascii="Calibri" w:hAnsi="Calibri" w:cs="Calibri"/>
-                <w:sz w:val="18"/>
-                <w:szCs w:val="18"/>
-              </w:rPr>
-              <w:t xml:space="preserve"/>
+              <w:t xml:space="preserve">55</w:t>
+            </w:r>
+          </w:p>
+        </w:tc>
+        <w:tc>
+          <w:tcPr>
+            <w:tcW w:w="1300" w:type="dxa"/>
+          </w:tcPr>
+          <w:p>
+            <w:pPr>
+              <w:spacing w:before="20" w:after="20"/>
+            </w:pPr>
+            <w:r>
+              <w:rPr>
+                <w:rFonts w:ascii="Calibri" w:hAnsi="Calibri" w:cs="Calibri"/>
+                <w:sz w:val="18"/>
+                <w:szCs w:val="18"/>
+              </w:rPr>
+              <w:t xml:space="preserve">Y</w:t>
             </w:r>
           </w:p>
         </w:tc>
@@ -4097,25 +4097,25 @@
                 <w:sz w:val="18"/>
                 <w:szCs w:val="18"/>
               </w:rPr>
-              <w:t xml:space="preserve"/>
-            </w:r>
-          </w:p>
-        </w:tc>
-        <w:tc>
-          <w:tcPr>
-            <w:tcW w:w="1300" w:type="dxa"/>
-          </w:tcPr>
-          <w:p>
-            <w:pPr>
-              <w:spacing w:before="20" w:after="20"/>
-            </w:pPr>
-            <w:r>
-              <w:rPr>
-                <w:rFonts w:ascii="Calibri" w:hAnsi="Calibri" w:cs="Calibri"/>
-                <w:sz w:val="18"/>
-                <w:szCs w:val="18"/>
-              </w:rPr>
-              <w:t xml:space="preserve"/>
+              <w:t xml:space="preserve">55</w:t>
+            </w:r>
+          </w:p>
+        </w:tc>
+        <w:tc>
+          <w:tcPr>
+            <w:tcW w:w="1300" w:type="dxa"/>
+          </w:tcPr>
+          <w:p>
+            <w:pPr>
+              <w:spacing w:before="20" w:after="20"/>
+            </w:pPr>
+            <w:r>
+              <w:rPr>
+                <w:rFonts w:ascii="Calibri" w:hAnsi="Calibri" w:cs="Calibri"/>
+                <w:sz w:val="18"/>
+                <w:szCs w:val="18"/>
+              </w:rPr>
+              <w:t xml:space="preserve">Y</w:t>
             </w:r>
           </w:p>
         </w:tc>
@@ -4225,25 +4225,25 @@
                 <w:sz w:val="18"/>
                 <w:szCs w:val="18"/>
               </w:rPr>
-              <w:t xml:space="preserve"/>
-            </w:r>
-          </w:p>
-        </w:tc>
-        <w:tc>
-          <w:tcPr>
-            <w:tcW w:w="1300" w:type="dxa"/>
-          </w:tcPr>
-          <w:p>
-            <w:pPr>
-              <w:spacing w:before="20" w:after="20"/>
-            </w:pPr>
-            <w:r>
-              <w:rPr>
-                <w:rFonts w:ascii="Calibri" w:hAnsi="Calibri" w:cs="Calibri"/>
-                <w:sz w:val="18"/>
-                <w:szCs w:val="18"/>
-              </w:rPr>
-              <w:t xml:space="preserve"/>
+              <w:t xml:space="preserve">55</w:t>
+            </w:r>
+          </w:p>
+        </w:tc>
+        <w:tc>
+          <w:tcPr>
+            <w:tcW w:w="1300" w:type="dxa"/>
+          </w:tcPr>
+          <w:p>
+            <w:pPr>
+              <w:spacing w:before="20" w:after="20"/>
+            </w:pPr>
+            <w:r>
+              <w:rPr>
+                <w:rFonts w:ascii="Calibri" w:hAnsi="Calibri" w:cs="Calibri"/>
+                <w:sz w:val="18"/>
+                <w:szCs w:val="18"/>
+              </w:rPr>
+              <w:t xml:space="preserve">Y</w:t>
             </w:r>
           </w:p>
         </w:tc>
@@ -4353,25 +4353,25 @@
                 <w:sz w:val="18"/>
                 <w:szCs w:val="18"/>
               </w:rPr>
-              <w:t xml:space="preserve"/>
-            </w:r>
-          </w:p>
-        </w:tc>
-        <w:tc>
-          <w:tcPr>
-            <w:tcW w:w="1300" w:type="dxa"/>
-          </w:tcPr>
-          <w:p>
-            <w:pPr>
-              <w:spacing w:before="20" w:after="20"/>
-            </w:pPr>
-            <w:r>
-              <w:rPr>
-                <w:rFonts w:ascii="Calibri" w:hAnsi="Calibri" w:cs="Calibri"/>
-                <w:sz w:val="18"/>
-                <w:szCs w:val="18"/>
-              </w:rPr>
-              <w:t xml:space="preserve"/>
+              <w:t xml:space="preserve">55</w:t>
+            </w:r>
+          </w:p>
+        </w:tc>
+        <w:tc>
+          <w:tcPr>
+            <w:tcW w:w="1300" w:type="dxa"/>
+          </w:tcPr>
+          <w:p>
+            <w:pPr>
+              <w:spacing w:before="20" w:after="20"/>
+            </w:pPr>
+            <w:r>
+              <w:rPr>
+                <w:rFonts w:ascii="Calibri" w:hAnsi="Calibri" w:cs="Calibri"/>
+                <w:sz w:val="18"/>
+                <w:szCs w:val="18"/>
+              </w:rPr>
+              <w:t xml:space="preserve">Y</w:t>
             </w:r>
           </w:p>
         </w:tc>
@@ -4481,25 +4481,25 @@
                 <w:sz w:val="18"/>
                 <w:szCs w:val="18"/>
               </w:rPr>
-              <w:t xml:space="preserve"/>
-            </w:r>
-          </w:p>
-        </w:tc>
-        <w:tc>
-          <w:tcPr>
-            <w:tcW w:w="1300" w:type="dxa"/>
-          </w:tcPr>
-          <w:p>
-            <w:pPr>
-              <w:spacing w:before="20" w:after="20"/>
-            </w:pPr>
-            <w:r>
-              <w:rPr>
-                <w:rFonts w:ascii="Calibri" w:hAnsi="Calibri" w:cs="Calibri"/>
-                <w:sz w:val="18"/>
-                <w:szCs w:val="18"/>
-              </w:rPr>
-              <w:t xml:space="preserve"/>
+              <w:t xml:space="preserve">55</w:t>
+            </w:r>
+          </w:p>
+        </w:tc>
+        <w:tc>
+          <w:tcPr>
+            <w:tcW w:w="1300" w:type="dxa"/>
+          </w:tcPr>
+          <w:p>
+            <w:pPr>
+              <w:spacing w:before="20" w:after="20"/>
+            </w:pPr>
+            <w:r>
+              <w:rPr>
+                <w:rFonts w:ascii="Calibri" w:hAnsi="Calibri" w:cs="Calibri"/>
+                <w:sz w:val="18"/>
+                <w:szCs w:val="18"/>
+              </w:rPr>
+              <w:t xml:space="preserve">Y</w:t>
             </w:r>
           </w:p>
         </w:tc>
@@ -4609,25 +4609,25 @@
                 <w:sz w:val="18"/>
                 <w:szCs w:val="18"/>
               </w:rPr>
-              <w:t xml:space="preserve"/>
-            </w:r>
-          </w:p>
-        </w:tc>
-        <w:tc>
-          <w:tcPr>
-            <w:tcW w:w="1300" w:type="dxa"/>
-          </w:tcPr>
-          <w:p>
-            <w:pPr>
-              <w:spacing w:before="20" w:after="20"/>
-            </w:pPr>
-            <w:r>
-              <w:rPr>
-                <w:rFonts w:ascii="Calibri" w:hAnsi="Calibri" w:cs="Calibri"/>
-                <w:sz w:val="18"/>
-                <w:szCs w:val="18"/>
-              </w:rPr>
-              <w:t xml:space="preserve"/>
+              <w:t xml:space="preserve">55</w:t>
+            </w:r>
+          </w:p>
+        </w:tc>
+        <w:tc>
+          <w:tcPr>
+            <w:tcW w:w="1300" w:type="dxa"/>
+          </w:tcPr>
+          <w:p>
+            <w:pPr>
+              <w:spacing w:before="20" w:after="20"/>
+            </w:pPr>
+            <w:r>
+              <w:rPr>
+                <w:rFonts w:ascii="Calibri" w:hAnsi="Calibri" w:cs="Calibri"/>
+                <w:sz w:val="18"/>
+                <w:szCs w:val="18"/>
+              </w:rPr>
+              <w:t xml:space="preserve">Y</w:t>
             </w:r>
           </w:p>
         </w:tc>
@@ -4737,25 +4737,25 @@
                 <w:sz w:val="18"/>
                 <w:szCs w:val="18"/>
               </w:rPr>
-              <w:t xml:space="preserve"/>
-            </w:r>
-          </w:p>
-        </w:tc>
-        <w:tc>
-          <w:tcPr>
-            <w:tcW w:w="1300" w:type="dxa"/>
-          </w:tcPr>
-          <w:p>
-            <w:pPr>
-              <w:spacing w:before="20" w:after="20"/>
-            </w:pPr>
-            <w:r>
-              <w:rPr>
-                <w:rFonts w:ascii="Calibri" w:hAnsi="Calibri" w:cs="Calibri"/>
-                <w:sz w:val="18"/>
-                <w:szCs w:val="18"/>
-              </w:rPr>
-              <w:t xml:space="preserve"/>
+              <w:t xml:space="preserve">55</w:t>
+            </w:r>
+          </w:p>
+        </w:tc>
+        <w:tc>
+          <w:tcPr>
+            <w:tcW w:w="1300" w:type="dxa"/>
+          </w:tcPr>
+          <w:p>
+            <w:pPr>
+              <w:spacing w:before="20" w:after="20"/>
+            </w:pPr>
+            <w:r>
+              <w:rPr>
+                <w:rFonts w:ascii="Calibri" w:hAnsi="Calibri" w:cs="Calibri"/>
+                <w:sz w:val="18"/>
+                <w:szCs w:val="18"/>
+              </w:rPr>
+              <w:t xml:space="preserve">Y</w:t>
             </w:r>
           </w:p>
         </w:tc>
@@ -4865,25 +4865,25 @@
                 <w:sz w:val="18"/>
                 <w:szCs w:val="18"/>
               </w:rPr>
-              <w:t xml:space="preserve"/>
-            </w:r>
-          </w:p>
-        </w:tc>
-        <w:tc>
-          <w:tcPr>
-            <w:tcW w:w="1300" w:type="dxa"/>
-          </w:tcPr>
-          <w:p>
-            <w:pPr>
-              <w:spacing w:before="20" w:after="20"/>
-            </w:pPr>
-            <w:r>
-              <w:rPr>
-                <w:rFonts w:ascii="Calibri" w:hAnsi="Calibri" w:cs="Calibri"/>
-                <w:sz w:val="18"/>
-                <w:szCs w:val="18"/>
-              </w:rPr>
-              <w:t xml:space="preserve"/>
+              <w:t xml:space="preserve">55</w:t>
+            </w:r>
+          </w:p>
+        </w:tc>
+        <w:tc>
+          <w:tcPr>
+            <w:tcW w:w="1300" w:type="dxa"/>
+          </w:tcPr>
+          <w:p>
+            <w:pPr>
+              <w:spacing w:before="20" w:after="20"/>
+            </w:pPr>
+            <w:r>
+              <w:rPr>
+                <w:rFonts w:ascii="Calibri" w:hAnsi="Calibri" w:cs="Calibri"/>
+                <w:sz w:val="18"/>
+                <w:szCs w:val="18"/>
+              </w:rPr>
+              <w:t xml:space="preserve">Y</w:t>
             </w:r>
           </w:p>
         </w:tc>
@@ -4993,25 +4993,25 @@
                 <w:sz w:val="18"/>
                 <w:szCs w:val="18"/>
               </w:rPr>
-              <w:t xml:space="preserve"/>
-            </w:r>
-          </w:p>
-        </w:tc>
-        <w:tc>
-          <w:tcPr>
-            <w:tcW w:w="1300" w:type="dxa"/>
-          </w:tcPr>
-          <w:p>
-            <w:pPr>
-              <w:spacing w:before="20" w:after="20"/>
-            </w:pPr>
-            <w:r>
-              <w:rPr>
-                <w:rFonts w:ascii="Calibri" w:hAnsi="Calibri" w:cs="Calibri"/>
-                <w:sz w:val="18"/>
-                <w:szCs w:val="18"/>
-              </w:rPr>
-              <w:t xml:space="preserve"/>
+              <w:t xml:space="preserve">55</w:t>
+            </w:r>
+          </w:p>
+        </w:tc>
+        <w:tc>
+          <w:tcPr>
+            <w:tcW w:w="1300" w:type="dxa"/>
+          </w:tcPr>
+          <w:p>
+            <w:pPr>
+              <w:spacing w:before="20" w:after="20"/>
+            </w:pPr>
+            <w:r>
+              <w:rPr>
+                <w:rFonts w:ascii="Calibri" w:hAnsi="Calibri" w:cs="Calibri"/>
+                <w:sz w:val="18"/>
+                <w:szCs w:val="18"/>
+              </w:rPr>
+              <w:t xml:space="preserve">Y</w:t>
             </w:r>
           </w:p>
         </w:tc>
@@ -5121,25 +5121,25 @@
                 <w:sz w:val="18"/>
                 <w:szCs w:val="18"/>
               </w:rPr>
-              <w:t xml:space="preserve"/>
-            </w:r>
-          </w:p>
-        </w:tc>
-        <w:tc>
-          <w:tcPr>
-            <w:tcW w:w="1300" w:type="dxa"/>
-          </w:tcPr>
-          <w:p>
-            <w:pPr>
-              <w:spacing w:before="20" w:after="20"/>
-            </w:pPr>
-            <w:r>
-              <w:rPr>
-                <w:rFonts w:ascii="Calibri" w:hAnsi="Calibri" w:cs="Calibri"/>
-                <w:sz w:val="18"/>
-                <w:szCs w:val="18"/>
-              </w:rPr>
-              <w:t xml:space="preserve"/>
+              <w:t xml:space="preserve">55</w:t>
+            </w:r>
+          </w:p>
+        </w:tc>
+        <w:tc>
+          <w:tcPr>
+            <w:tcW w:w="1300" w:type="dxa"/>
+          </w:tcPr>
+          <w:p>
+            <w:pPr>
+              <w:spacing w:before="20" w:after="20"/>
+            </w:pPr>
+            <w:r>
+              <w:rPr>
+                <w:rFonts w:ascii="Calibri" w:hAnsi="Calibri" w:cs="Calibri"/>
+                <w:sz w:val="18"/>
+                <w:szCs w:val="18"/>
+              </w:rPr>
+              <w:t xml:space="preserve">Y</w:t>
             </w:r>
           </w:p>
         </w:tc>
@@ -5249,25 +5249,25 @@
                 <w:sz w:val="18"/>
                 <w:szCs w:val="18"/>
               </w:rPr>
-              <w:t xml:space="preserve"/>
-            </w:r>
-          </w:p>
-        </w:tc>
-        <w:tc>
-          <w:tcPr>
-            <w:tcW w:w="1300" w:type="dxa"/>
-          </w:tcPr>
-          <w:p>
-            <w:pPr>
-              <w:spacing w:before="20" w:after="20"/>
-            </w:pPr>
-            <w:r>
-              <w:rPr>
-                <w:rFonts w:ascii="Calibri" w:hAnsi="Calibri" w:cs="Calibri"/>
-                <w:sz w:val="18"/>
-                <w:szCs w:val="18"/>
-              </w:rPr>
-              <w:t xml:space="preserve"/>
+              <w:t xml:space="preserve">55</w:t>
+            </w:r>
+          </w:p>
+        </w:tc>
+        <w:tc>
+          <w:tcPr>
+            <w:tcW w:w="1300" w:type="dxa"/>
+          </w:tcPr>
+          <w:p>
+            <w:pPr>
+              <w:spacing w:before="20" w:after="20"/>
+            </w:pPr>
+            <w:r>
+              <w:rPr>
+                <w:rFonts w:ascii="Calibri" w:hAnsi="Calibri" w:cs="Calibri"/>
+                <w:sz w:val="18"/>
+                <w:szCs w:val="18"/>
+              </w:rPr>
+              <w:t xml:space="preserve">Y</w:t>
             </w:r>
           </w:p>
         </w:tc>
@@ -5586,25 +5586,25 @@
                 <w:sz w:val="18"/>
                 <w:szCs w:val="18"/>
               </w:rPr>
-              <w:t xml:space="preserve"/>
-            </w:r>
-          </w:p>
-        </w:tc>
-        <w:tc>
-          <w:tcPr>
-            <w:tcW w:w="1300" w:type="dxa"/>
-          </w:tcPr>
-          <w:p>
-            <w:pPr>
-              <w:spacing w:before="20" w:after="20"/>
-            </w:pPr>
-            <w:r>
-              <w:rPr>
-                <w:rFonts w:ascii="Calibri" w:hAnsi="Calibri" w:cs="Calibri"/>
-                <w:sz w:val="18"/>
-                <w:szCs w:val="18"/>
-              </w:rPr>
-              <w:t xml:space="preserve"/>
+              <w:t xml:space="preserve">56</w:t>
+            </w:r>
+          </w:p>
+        </w:tc>
+        <w:tc>
+          <w:tcPr>
+            <w:tcW w:w="1300" w:type="dxa"/>
+          </w:tcPr>
+          <w:p>
+            <w:pPr>
+              <w:spacing w:before="20" w:after="20"/>
+            </w:pPr>
+            <w:r>
+              <w:rPr>
+                <w:rFonts w:ascii="Calibri" w:hAnsi="Calibri" w:cs="Calibri"/>
+                <w:sz w:val="18"/>
+                <w:szCs w:val="18"/>
+              </w:rPr>
+              <w:t xml:space="preserve">Y</w:t>
             </w:r>
           </w:p>
         </w:tc>
@@ -5714,25 +5714,25 @@
                 <w:sz w:val="18"/>
                 <w:szCs w:val="18"/>
               </w:rPr>
-              <w:t xml:space="preserve"/>
-            </w:r>
-          </w:p>
-        </w:tc>
-        <w:tc>
-          <w:tcPr>
-            <w:tcW w:w="1300" w:type="dxa"/>
-          </w:tcPr>
-          <w:p>
-            <w:pPr>
-              <w:spacing w:before="20" w:after="20"/>
-            </w:pPr>
-            <w:r>
-              <w:rPr>
-                <w:rFonts w:ascii="Calibri" w:hAnsi="Calibri" w:cs="Calibri"/>
-                <w:sz w:val="18"/>
-                <w:szCs w:val="18"/>
-              </w:rPr>
-              <w:t xml:space="preserve"/>
+              <w:t xml:space="preserve">56</w:t>
+            </w:r>
+          </w:p>
+        </w:tc>
+        <w:tc>
+          <w:tcPr>
+            <w:tcW w:w="1300" w:type="dxa"/>
+          </w:tcPr>
+          <w:p>
+            <w:pPr>
+              <w:spacing w:before="20" w:after="20"/>
+            </w:pPr>
+            <w:r>
+              <w:rPr>
+                <w:rFonts w:ascii="Calibri" w:hAnsi="Calibri" w:cs="Calibri"/>
+                <w:sz w:val="18"/>
+                <w:szCs w:val="18"/>
+              </w:rPr>
+              <w:t xml:space="preserve">Y</w:t>
             </w:r>
           </w:p>
         </w:tc>
@@ -5842,25 +5842,25 @@
                 <w:sz w:val="18"/>
                 <w:szCs w:val="18"/>
               </w:rPr>
-              <w:t xml:space="preserve"/>
-            </w:r>
-          </w:p>
-        </w:tc>
-        <w:tc>
-          <w:tcPr>
-            <w:tcW w:w="1300" w:type="dxa"/>
-          </w:tcPr>
-          <w:p>
-            <w:pPr>
-              <w:spacing w:before="20" w:after="20"/>
-            </w:pPr>
-            <w:r>
-              <w:rPr>
-                <w:rFonts w:ascii="Calibri" w:hAnsi="Calibri" w:cs="Calibri"/>
-                <w:sz w:val="18"/>
-                <w:szCs w:val="18"/>
-              </w:rPr>
-              <w:t xml:space="preserve"/>
+              <w:t xml:space="preserve">56</w:t>
+            </w:r>
+          </w:p>
+        </w:tc>
+        <w:tc>
+          <w:tcPr>
+            <w:tcW w:w="1300" w:type="dxa"/>
+          </w:tcPr>
+          <w:p>
+            <w:pPr>
+              <w:spacing w:before="20" w:after="20"/>
+            </w:pPr>
+            <w:r>
+              <w:rPr>
+                <w:rFonts w:ascii="Calibri" w:hAnsi="Calibri" w:cs="Calibri"/>
+                <w:sz w:val="18"/>
+                <w:szCs w:val="18"/>
+              </w:rPr>
+              <w:t xml:space="preserve">Y</w:t>
             </w:r>
           </w:p>
         </w:tc>
@@ -5970,25 +5970,25 @@
                 <w:sz w:val="18"/>
                 <w:szCs w:val="18"/>
               </w:rPr>
-              <w:t xml:space="preserve"/>
-            </w:r>
-          </w:p>
-        </w:tc>
-        <w:tc>
-          <w:tcPr>
-            <w:tcW w:w="1300" w:type="dxa"/>
-          </w:tcPr>
-          <w:p>
-            <w:pPr>
-              <w:spacing w:before="20" w:after="20"/>
-            </w:pPr>
-            <w:r>
-              <w:rPr>
-                <w:rFonts w:ascii="Calibri" w:hAnsi="Calibri" w:cs="Calibri"/>
-                <w:sz w:val="18"/>
-                <w:szCs w:val="18"/>
-              </w:rPr>
-              <w:t xml:space="preserve"/>
+              <w:t xml:space="preserve">56</w:t>
+            </w:r>
+          </w:p>
+        </w:tc>
+        <w:tc>
+          <w:tcPr>
+            <w:tcW w:w="1300" w:type="dxa"/>
+          </w:tcPr>
+          <w:p>
+            <w:pPr>
+              <w:spacing w:before="20" w:after="20"/>
+            </w:pPr>
+            <w:r>
+              <w:rPr>
+                <w:rFonts w:ascii="Calibri" w:hAnsi="Calibri" w:cs="Calibri"/>
+                <w:sz w:val="18"/>
+                <w:szCs w:val="18"/>
+              </w:rPr>
+              <w:t xml:space="preserve">Y</w:t>
             </w:r>
           </w:p>
         </w:tc>
@@ -6036,7 +6036,7 @@
           <w:sz w:val="20"/>
           <w:szCs w:val="20"/>
         </w:rPr>
-        <w:t xml:space="preserve">Figures checked: ______ of 40.     Figures corrected: ______.</w:t>
+        <w:t xml:space="preserve">Figures checked: 38 of 40 (2 are derived and not in the filing).     Figures corrected: 0.</w:t>
       </w:r>
     </w:p>
     <w:sectPr>

</xml_diff>